<commit_message>
new task - review
</commit_message>
<xml_diff>
--- a/WEEK 4.1.docx
+++ b/WEEK 4.1.docx
@@ -4482,9 +4482,7 @@
         </w:rPr>
       </w:pPr>
       <w:r>
-        <w:rPr>
-          <w:rFonts w:ascii="aptos" w:hAnsi="aptos"/>
-        </w:rPr>
+        <w:rPr/>
         <w:drawing>
           <wp:inline distT="0" distB="0" distL="0" distR="0">
             <wp:extent cx="4578350" cy="7976870"/>
@@ -17007,7 +17005,20 @@
       </w:pPr>
       <w:r>
         <w:rPr>
-          <w:rFonts w:ascii="aptos" w:hAnsi="aptos"/>
+          <w:b w:val="false"/>
+          <w:bCs w:val="false"/>
+          <w:i w:val="false"/>
+          <w:iCs w:val="false"/>
+          <w:caps w:val="false"/>
+          <w:smallCaps w:val="false"/>
+          <w:strike w:val="false"/>
+          <w:dstrike w:val="false"/>
+          <w:color w:val="000000"/>
+          <w:sz w:val="28"/>
+          <w:szCs w:val="28"/>
+          <w:u w:val="none"/>
+          <w:effect w:val="none"/>
+          <w:shd w:fill="auto" w:val="clear"/>
         </w:rPr>
       </w:r>
     </w:p>
@@ -17037,7 +17048,20 @@
       </w:pPr>
       <w:r>
         <w:rPr>
-          <w:rFonts w:ascii="aptos" w:hAnsi="aptos"/>
+          <w:b w:val="false"/>
+          <w:bCs w:val="false"/>
+          <w:i w:val="false"/>
+          <w:iCs w:val="false"/>
+          <w:caps w:val="false"/>
+          <w:smallCaps w:val="false"/>
+          <w:strike w:val="false"/>
+          <w:dstrike w:val="false"/>
+          <w:color w:val="000000"/>
+          <w:sz w:val="28"/>
+          <w:szCs w:val="28"/>
+          <w:u w:val="none"/>
+          <w:effect w:val="none"/>
+          <w:shd w:fill="auto" w:val="clear"/>
         </w:rPr>
       </w:r>
     </w:p>
@@ -17067,7 +17091,20 @@
       </w:pPr>
       <w:r>
         <w:rPr>
-          <w:rFonts w:ascii="aptos" w:hAnsi="aptos"/>
+          <w:b w:val="false"/>
+          <w:bCs w:val="false"/>
+          <w:i w:val="false"/>
+          <w:iCs w:val="false"/>
+          <w:caps w:val="false"/>
+          <w:smallCaps w:val="false"/>
+          <w:strike w:val="false"/>
+          <w:dstrike w:val="false"/>
+          <w:color w:val="000000"/>
+          <w:sz w:val="28"/>
+          <w:szCs w:val="28"/>
+          <w:u w:val="none"/>
+          <w:effect w:val="none"/>
+          <w:shd w:fill="auto" w:val="clear"/>
         </w:rPr>
       </w:r>
     </w:p>
@@ -17097,7 +17134,20 @@
       </w:pPr>
       <w:r>
         <w:rPr>
-          <w:rFonts w:ascii="aptos" w:hAnsi="aptos"/>
+          <w:b w:val="false"/>
+          <w:bCs w:val="false"/>
+          <w:i w:val="false"/>
+          <w:iCs w:val="false"/>
+          <w:caps w:val="false"/>
+          <w:smallCaps w:val="false"/>
+          <w:strike w:val="false"/>
+          <w:dstrike w:val="false"/>
+          <w:color w:val="000000"/>
+          <w:sz w:val="28"/>
+          <w:szCs w:val="28"/>
+          <w:u w:val="none"/>
+          <w:effect w:val="none"/>
+          <w:shd w:fill="auto" w:val="clear"/>
         </w:rPr>
       </w:r>
     </w:p>
@@ -17127,7 +17177,20 @@
       </w:pPr>
       <w:r>
         <w:rPr>
-          <w:rFonts w:ascii="aptos" w:hAnsi="aptos"/>
+          <w:b w:val="false"/>
+          <w:bCs w:val="false"/>
+          <w:i w:val="false"/>
+          <w:iCs w:val="false"/>
+          <w:caps w:val="false"/>
+          <w:smallCaps w:val="false"/>
+          <w:strike w:val="false"/>
+          <w:dstrike w:val="false"/>
+          <w:color w:val="000000"/>
+          <w:sz w:val="28"/>
+          <w:szCs w:val="28"/>
+          <w:u w:val="none"/>
+          <w:effect w:val="none"/>
+          <w:shd w:fill="auto" w:val="clear"/>
         </w:rPr>
       </w:r>
     </w:p>
@@ -17157,7 +17220,20 @@
       </w:pPr>
       <w:r>
         <w:rPr>
-          <w:rFonts w:ascii="aptos" w:hAnsi="aptos"/>
+          <w:b w:val="false"/>
+          <w:bCs w:val="false"/>
+          <w:i w:val="false"/>
+          <w:iCs w:val="false"/>
+          <w:caps w:val="false"/>
+          <w:smallCaps w:val="false"/>
+          <w:strike w:val="false"/>
+          <w:dstrike w:val="false"/>
+          <w:color w:val="000000"/>
+          <w:sz w:val="28"/>
+          <w:szCs w:val="28"/>
+          <w:u w:val="none"/>
+          <w:effect w:val="none"/>
+          <w:shd w:fill="auto" w:val="clear"/>
         </w:rPr>
       </w:r>
     </w:p>
@@ -17187,7 +17263,20 @@
       </w:pPr>
       <w:r>
         <w:rPr>
-          <w:rFonts w:ascii="aptos" w:hAnsi="aptos"/>
+          <w:b w:val="false"/>
+          <w:bCs w:val="false"/>
+          <w:i w:val="false"/>
+          <w:iCs w:val="false"/>
+          <w:caps w:val="false"/>
+          <w:smallCaps w:val="false"/>
+          <w:strike w:val="false"/>
+          <w:dstrike w:val="false"/>
+          <w:color w:val="000000"/>
+          <w:sz w:val="28"/>
+          <w:szCs w:val="28"/>
+          <w:u w:val="none"/>
+          <w:effect w:val="none"/>
+          <w:shd w:fill="auto" w:val="clear"/>
         </w:rPr>
       </w:r>
     </w:p>
@@ -17217,7 +17306,20 @@
       </w:pPr>
       <w:r>
         <w:rPr>
-          <w:rFonts w:ascii="aptos" w:hAnsi="aptos"/>
+          <w:b w:val="false"/>
+          <w:bCs w:val="false"/>
+          <w:i w:val="false"/>
+          <w:iCs w:val="false"/>
+          <w:caps w:val="false"/>
+          <w:smallCaps w:val="false"/>
+          <w:strike w:val="false"/>
+          <w:dstrike w:val="false"/>
+          <w:color w:val="000000"/>
+          <w:sz w:val="28"/>
+          <w:szCs w:val="28"/>
+          <w:u w:val="none"/>
+          <w:effect w:val="none"/>
+          <w:shd w:fill="auto" w:val="clear"/>
         </w:rPr>
       </w:r>
     </w:p>
@@ -17247,7 +17349,20 @@
       </w:pPr>
       <w:r>
         <w:rPr>
-          <w:rFonts w:ascii="aptos" w:hAnsi="aptos"/>
+          <w:b w:val="false"/>
+          <w:bCs w:val="false"/>
+          <w:i w:val="false"/>
+          <w:iCs w:val="false"/>
+          <w:caps w:val="false"/>
+          <w:smallCaps w:val="false"/>
+          <w:strike w:val="false"/>
+          <w:dstrike w:val="false"/>
+          <w:color w:val="000000"/>
+          <w:sz w:val="28"/>
+          <w:szCs w:val="28"/>
+          <w:u w:val="none"/>
+          <w:effect w:val="none"/>
+          <w:shd w:fill="auto" w:val="clear"/>
         </w:rPr>
       </w:r>
     </w:p>
@@ -17277,7 +17392,20 @@
       </w:pPr>
       <w:r>
         <w:rPr>
-          <w:rFonts w:ascii="aptos" w:hAnsi="aptos"/>
+          <w:b w:val="false"/>
+          <w:bCs w:val="false"/>
+          <w:i w:val="false"/>
+          <w:iCs w:val="false"/>
+          <w:caps w:val="false"/>
+          <w:smallCaps w:val="false"/>
+          <w:strike w:val="false"/>
+          <w:dstrike w:val="false"/>
+          <w:color w:val="000000"/>
+          <w:sz w:val="28"/>
+          <w:szCs w:val="28"/>
+          <w:u w:val="none"/>
+          <w:effect w:val="none"/>
+          <w:shd w:fill="auto" w:val="clear"/>
         </w:rPr>
       </w:r>
     </w:p>
@@ -17307,7 +17435,20 @@
       </w:pPr>
       <w:r>
         <w:rPr>
-          <w:rFonts w:ascii="aptos" w:hAnsi="aptos"/>
+          <w:b w:val="false"/>
+          <w:bCs w:val="false"/>
+          <w:i w:val="false"/>
+          <w:iCs w:val="false"/>
+          <w:caps w:val="false"/>
+          <w:smallCaps w:val="false"/>
+          <w:strike w:val="false"/>
+          <w:dstrike w:val="false"/>
+          <w:color w:val="000000"/>
+          <w:sz w:val="28"/>
+          <w:szCs w:val="28"/>
+          <w:u w:val="none"/>
+          <w:effect w:val="none"/>
+          <w:shd w:fill="auto" w:val="clear"/>
         </w:rPr>
       </w:r>
     </w:p>
@@ -17337,7 +17478,20 @@
       </w:pPr>
       <w:r>
         <w:rPr>
-          <w:rFonts w:ascii="aptos" w:hAnsi="aptos"/>
+          <w:b w:val="false"/>
+          <w:bCs w:val="false"/>
+          <w:i w:val="false"/>
+          <w:iCs w:val="false"/>
+          <w:caps w:val="false"/>
+          <w:smallCaps w:val="false"/>
+          <w:strike w:val="false"/>
+          <w:dstrike w:val="false"/>
+          <w:color w:val="000000"/>
+          <w:sz w:val="28"/>
+          <w:szCs w:val="28"/>
+          <w:u w:val="none"/>
+          <w:effect w:val="none"/>
+          <w:shd w:fill="auto" w:val="clear"/>
         </w:rPr>
       </w:r>
     </w:p>
@@ -17368,17 +17522,28 @@
       <w:r>
         <w:rPr>
           <w:rFonts w:ascii="aptos" w:hAnsi="aptos"/>
+          <w:i w:val="false"/>
+          <w:caps w:val="false"/>
+          <w:smallCaps w:val="false"/>
+          <w:strike w:val="false"/>
+          <w:dstrike w:val="false"/>
+          <w:color w:val="000000"/>
+          <w:sz w:val="28"/>
+          <w:szCs w:val="28"/>
+          <w:u w:val="none"/>
+          <w:effect w:val="none"/>
+          <w:shd w:fill="auto" w:val="clear"/>
         </w:rPr>
         <w:drawing>
           <wp:anchor behindDoc="0" distT="0" distB="0" distL="0" distR="0" simplePos="0" locked="0" layoutInCell="0" allowOverlap="1" relativeHeight="19">
             <wp:simplePos x="0" y="0"/>
             <wp:positionH relativeFrom="column">
-              <wp:posOffset>45720</wp:posOffset>
+              <wp:posOffset>-31750</wp:posOffset>
             </wp:positionH>
             <wp:positionV relativeFrom="paragraph">
-              <wp:posOffset>146050</wp:posOffset>
+              <wp:posOffset>-635</wp:posOffset>
             </wp:positionV>
-            <wp:extent cx="2321560" cy="4671060"/>
+            <wp:extent cx="2212340" cy="4450715"/>
             <wp:effectExtent l="0" t="0" r="0" b="0"/>
             <wp:wrapTopAndBottom/>
             <wp:docPr id="18" name="Image10" descr=""/>
@@ -17403,7 +17568,7 @@
                   <pic:spPr bwMode="auto">
                     <a:xfrm>
                       <a:off x="0" y="0"/>
-                      <a:ext cx="2321560" cy="4671060"/>
+                      <a:ext cx="2212340" cy="4450715"/>
                     </a:xfrm>
                     <a:prstGeom prst="rect">
                       <a:avLst/>
@@ -17414,54 +17579,16 @@
             </a:graphic>
           </wp:anchor>
         </w:drawing>
-      </w:r>
-    </w:p>
-    <w:p>
-      <w:pPr>
-        <w:pStyle w:val="TextBody"/>
-        <w:spacing w:before="0" w:after="140"/>
-        <w:jc w:val="both"/>
-        <w:rPr>
-          <w:rFonts w:ascii="aptos" w:hAnsi="aptos"/>
-          <w:i w:val="false"/>
-          <w:i w:val="false"/>
-          <w:caps w:val="false"/>
-          <w:smallCaps w:val="false"/>
-          <w:strike w:val="false"/>
-          <w:dstrike w:val="false"/>
-          <w:color w:val="000000"/>
-          <w:sz w:val="28"/>
-          <w:szCs w:val="28"/>
-          <w:u w:val="none"/>
-          <w:effect w:val="none"/>
-          <w:shd w:fill="auto" w:val="clear"/>
-        </w:rPr>
-      </w:pPr>
-      <w:r>
-        <w:rPr>
-          <w:rFonts w:ascii="aptos" w:hAnsi="aptos"/>
-          <w:i w:val="false"/>
-          <w:caps w:val="false"/>
-          <w:smallCaps w:val="false"/>
-          <w:strike w:val="false"/>
-          <w:dstrike w:val="false"/>
-          <w:color w:val="000000"/>
-          <w:sz w:val="28"/>
-          <w:szCs w:val="28"/>
-          <w:u w:val="none"/>
-          <w:effect w:val="none"/>
-          <w:shd w:fill="auto" w:val="clear"/>
-        </w:rPr>
         <w:drawing>
           <wp:anchor behindDoc="0" distT="0" distB="0" distL="0" distR="0" simplePos="0" locked="0" layoutInCell="0" allowOverlap="1" relativeHeight="20">
             <wp:simplePos x="0" y="0"/>
             <wp:positionH relativeFrom="column">
-              <wp:posOffset>45720</wp:posOffset>
+              <wp:posOffset>-31750</wp:posOffset>
             </wp:positionH>
             <wp:positionV relativeFrom="paragraph">
-              <wp:posOffset>-113030</wp:posOffset>
+              <wp:posOffset>4449445</wp:posOffset>
             </wp:positionV>
-            <wp:extent cx="1837055" cy="4303395"/>
+            <wp:extent cx="1747520" cy="4094480"/>
             <wp:effectExtent l="0" t="0" r="0" b="0"/>
             <wp:wrapTopAndBottom/>
             <wp:docPr id="19" name="Image11" descr=""/>
@@ -17486,7 +17613,7 @@
                   <pic:spPr bwMode="auto">
                     <a:xfrm>
                       <a:off x="0" y="0"/>
-                      <a:ext cx="1837055" cy="4303395"/>
+                      <a:ext cx="1747520" cy="4094480"/>
                     </a:xfrm>
                     <a:prstGeom prst="rect">
                       <a:avLst/>
@@ -17817,22 +17944,33 @@
         </w:rPr>
       </w:pPr>
       <w:r>
-        <w:rPr/>
-      </w:r>
-    </w:p>
-    <w:p>
-      <w:pPr>
-        <w:pStyle w:val="TextBody"/>
-        <w:jc w:val="both"/>
-        <w:rPr>
-          <w:rFonts w:ascii="aptos" w:hAnsi="aptos"/>
-        </w:rPr>
-      </w:pPr>
-      <w:r>
         <w:rPr>
           <w:rFonts w:ascii="aptos" w:hAnsi="aptos"/>
           <w:b w:val="false"/>
           <w:bCs w:val="false"/>
+          <w:i w:val="false"/>
+          <w:caps w:val="false"/>
+          <w:smallCaps w:val="false"/>
+          <w:color w:val="auto"/>
+          <w:spacing w:val="0"/>
+          <w:sz w:val="28"/>
+          <w:szCs w:val="28"/>
+        </w:rPr>
+      </w:r>
+    </w:p>
+    <w:p>
+      <w:pPr>
+        <w:pStyle w:val="TextBody"/>
+        <w:jc w:val="both"/>
+        <w:rPr>
+          <w:rFonts w:ascii="aptos" w:hAnsi="aptos"/>
+        </w:rPr>
+      </w:pPr>
+      <w:r>
+        <w:rPr>
+          <w:rFonts w:ascii="aptos" w:hAnsi="aptos"/>
+          <w:b w:val="false"/>
+          <w:bCs w:val="false"/>
           <w:sz w:val="28"/>
           <w:szCs w:val="28"/>
         </w:rPr>
@@ -18538,17 +18676,7 @@
           <w:sz w:val="28"/>
           <w:szCs w:val="28"/>
         </w:rPr>
-        <w:t xml:space="preserve">Ans: </w:t>
-      </w:r>
-      <w:r>
-        <w:rPr>
-          <w:rFonts w:ascii="aptos" w:hAnsi="aptos"/>
-          <w:b w:val="false"/>
-          <w:bCs w:val="false"/>
-          <w:sz w:val="28"/>
-          <w:szCs w:val="28"/>
-        </w:rPr>
-        <w:t>The first time when user render the page, it loads some tasks around 20.</w:t>
+        <w:t>Ans: The first time when user render the page, it loads some tasks around 20.</w:t>
       </w:r>
     </w:p>
     <w:p>
@@ -19931,67 +20059,7 @@
           <w:sz w:val="28"/>
           <w:szCs w:val="26"/>
         </w:rPr>
-        <w:t>Then show the {isLoading === “</w:t>
-      </w:r>
-      <w:r>
-        <w:rPr>
-          <w:rFonts w:ascii="aptos" w:hAnsi="aptos"/>
-          <w:b w:val="false"/>
-          <w:bCs w:val="false"/>
-          <w:sz w:val="28"/>
-          <w:szCs w:val="26"/>
-        </w:rPr>
-        <w:t>delete</w:t>
-      </w:r>
-      <w:r>
-        <w:rPr>
-          <w:rFonts w:ascii="aptos" w:hAnsi="aptos"/>
-          <w:b w:val="false"/>
-          <w:bCs w:val="false"/>
-          <w:sz w:val="28"/>
-          <w:szCs w:val="26"/>
-        </w:rPr>
-        <w:t>” ?  “</w:t>
-      </w:r>
-      <w:r>
-        <w:rPr>
-          <w:rFonts w:ascii="aptos" w:hAnsi="aptos"/>
-          <w:b w:val="false"/>
-          <w:bCs w:val="false"/>
-          <w:sz w:val="28"/>
-          <w:szCs w:val="26"/>
-        </w:rPr>
-        <w:t>deleting</w:t>
-      </w:r>
-      <w:r>
-        <w:rPr>
-          <w:rFonts w:ascii="aptos" w:hAnsi="aptos"/>
-          <w:b w:val="false"/>
-          <w:bCs w:val="false"/>
-          <w:sz w:val="28"/>
-          <w:szCs w:val="26"/>
-        </w:rPr>
-        <w:t>…” : “</w:t>
-      </w:r>
-      <w:r>
-        <w:rPr>
-          <w:rFonts w:ascii="aptos" w:hAnsi="aptos"/>
-          <w:b w:val="false"/>
-          <w:bCs w:val="false"/>
-          <w:sz w:val="28"/>
-          <w:szCs w:val="26"/>
-        </w:rPr>
-        <w:t>delete</w:t>
-      </w:r>
-      <w:r>
-        <w:rPr>
-          <w:rFonts w:ascii="aptos" w:hAnsi="aptos"/>
-          <w:b w:val="false"/>
-          <w:bCs w:val="false"/>
-          <w:sz w:val="28"/>
-          <w:szCs w:val="26"/>
-        </w:rPr>
-        <w:t>”}</w:t>
+        <w:t>Then show the {isLoading === “delete” ?  “deleting…” : “delete”}</w:t>
       </w:r>
     </w:p>
     <w:p>
@@ -20334,557 +20402,1400 @@
     <w:p>
       <w:pPr>
         <w:pStyle w:val="TextBody"/>
+        <w:jc w:val="both"/>
+        <w:rPr>
+          <w:rFonts w:ascii="aptos" w:hAnsi="aptos"/>
+          <w:sz w:val="28"/>
+          <w:szCs w:val="28"/>
+        </w:rPr>
+      </w:pPr>
+      <w:r>
+        <w:rPr>
+          <w:rFonts w:ascii="aptos" w:hAnsi="aptos"/>
+          <w:sz w:val="28"/>
+          <w:szCs w:val="28"/>
+        </w:rPr>
+        <w:t>1. Multiple interceptor:</w:t>
+      </w:r>
+    </w:p>
+    <w:p>
+      <w:pPr>
+        <w:pStyle w:val="TextBody"/>
+        <w:numPr>
+          <w:ilvl w:val="0"/>
+          <w:numId w:val="65"/>
+        </w:numPr>
+        <w:jc w:val="both"/>
+        <w:rPr>
+          <w:rFonts w:ascii="aptos" w:hAnsi="aptos"/>
+          <w:sz w:val="28"/>
+          <w:szCs w:val="28"/>
+        </w:rPr>
+      </w:pPr>
+      <w:r>
+        <w:rPr>
+          <w:rFonts w:ascii="aptos" w:hAnsi="aptos"/>
+          <w:sz w:val="28"/>
+          <w:szCs w:val="28"/>
+        </w:rPr>
+        <w:t>W</w:t>
+      </w:r>
+      <w:r>
+        <w:rPr>
+          <w:rFonts w:ascii="aptos" w:hAnsi="aptos"/>
+          <w:sz w:val="28"/>
+          <w:szCs w:val="28"/>
+        </w:rPr>
+        <w:t>e can add multiple interceptor for different action.</w:t>
+      </w:r>
+    </w:p>
+    <w:p>
+      <w:pPr>
+        <w:pStyle w:val="TextBody"/>
+        <w:numPr>
+          <w:ilvl w:val="0"/>
+          <w:numId w:val="65"/>
+        </w:numPr>
+        <w:jc w:val="both"/>
+        <w:rPr>
+          <w:rFonts w:ascii="aptos" w:hAnsi="aptos"/>
+          <w:sz w:val="28"/>
+          <w:szCs w:val="28"/>
+        </w:rPr>
+      </w:pPr>
+      <w:r>
+        <w:rPr>
+          <w:rFonts w:ascii="aptos" w:hAnsi="aptos"/>
+          <w:sz w:val="28"/>
+          <w:szCs w:val="28"/>
+        </w:rPr>
+        <w:t>Each interceptor will be executed</w:t>
+      </w:r>
+    </w:p>
+    <w:p>
+      <w:pPr>
+        <w:pStyle w:val="TextBody"/>
+        <w:numPr>
+          <w:ilvl w:val="0"/>
+          <w:numId w:val="65"/>
+        </w:numPr>
+        <w:jc w:val="both"/>
+        <w:rPr>
+          <w:rFonts w:ascii="aptos" w:hAnsi="aptos"/>
+          <w:sz w:val="28"/>
+          <w:szCs w:val="28"/>
+        </w:rPr>
+      </w:pPr>
+      <w:r>
+        <w:rPr>
+          <w:rFonts w:ascii="aptos" w:hAnsi="aptos"/>
+          <w:sz w:val="28"/>
+          <w:szCs w:val="28"/>
+        </w:rPr>
+        <w:t>R</w:t>
+      </w:r>
+      <w:r>
+        <w:rPr>
+          <w:rFonts w:ascii="aptos" w:hAnsi="aptos"/>
+          <w:sz w:val="28"/>
+          <w:szCs w:val="28"/>
+        </w:rPr>
+        <w:t>equest interceptor are executed in reverse order (LIFO).this is done so that default system configuration (by default config) can be overriden by more specific,</w:t>
+      </w:r>
+    </w:p>
+    <w:p>
+      <w:pPr>
+        <w:pStyle w:val="TextBody"/>
+        <w:numPr>
+          <w:ilvl w:val="0"/>
+          <w:numId w:val="65"/>
+        </w:numPr>
+        <w:jc w:val="both"/>
+        <w:rPr>
+          <w:rFonts w:ascii="aptos" w:hAnsi="aptos"/>
+          <w:sz w:val="28"/>
+          <w:szCs w:val="28"/>
+        </w:rPr>
+      </w:pPr>
+      <w:r>
+        <w:rPr>
+          <w:rFonts w:ascii="aptos" w:hAnsi="aptos"/>
+          <w:sz w:val="28"/>
+          <w:szCs w:val="28"/>
+        </w:rPr>
+        <w:t>R</w:t>
+      </w:r>
+      <w:r>
+        <w:rPr>
+          <w:rFonts w:ascii="aptos" w:hAnsi="aptos"/>
+          <w:sz w:val="28"/>
+          <w:szCs w:val="28"/>
+        </w:rPr>
+        <w:t xml:space="preserve">esponse interceptor are executed in same order they were added (FIFO) </w:t>
+      </w:r>
+    </w:p>
+    <w:p>
+      <w:pPr>
+        <w:pStyle w:val="TextBody"/>
+        <w:numPr>
+          <w:ilvl w:val="0"/>
+          <w:numId w:val="65"/>
+        </w:numPr>
+        <w:jc w:val="both"/>
+        <w:rPr>
+          <w:rFonts w:ascii="aptos" w:hAnsi="aptos"/>
+          <w:sz w:val="28"/>
+          <w:szCs w:val="28"/>
+        </w:rPr>
+      </w:pPr>
+      <w:r>
+        <w:rPr>
+          <w:rFonts w:ascii="aptos" w:hAnsi="aptos"/>
+          <w:sz w:val="28"/>
+          <w:szCs w:val="28"/>
+        </w:rPr>
+        <w:t>I</w:t>
+      </w:r>
+      <w:r>
+        <w:rPr>
+          <w:rFonts w:ascii="aptos" w:hAnsi="aptos"/>
+          <w:sz w:val="28"/>
+          <w:szCs w:val="28"/>
+        </w:rPr>
+        <w:t>nterceptor pass the result to the next interceptor.</w:t>
+      </w:r>
+    </w:p>
+    <w:p>
+      <w:pPr>
+        <w:pStyle w:val="TextBody"/>
+        <w:numPr>
+          <w:ilvl w:val="0"/>
+          <w:numId w:val="65"/>
+        </w:numPr>
+        <w:jc w:val="both"/>
+        <w:rPr>
+          <w:rFonts w:ascii="aptos" w:hAnsi="aptos"/>
+          <w:sz w:val="28"/>
+          <w:szCs w:val="28"/>
+        </w:rPr>
+      </w:pPr>
+      <w:r>
+        <w:rPr>
+          <w:rFonts w:ascii="aptos" w:hAnsi="aptos"/>
+          <w:sz w:val="28"/>
+          <w:szCs w:val="28"/>
+        </w:rPr>
+        <w:t>Every interceptor gets the result of its previos interceptor.</w:t>
+      </w:r>
+    </w:p>
+    <w:p>
+      <w:pPr>
+        <w:pStyle w:val="TextBody"/>
+        <w:numPr>
+          <w:ilvl w:val="0"/>
+          <w:numId w:val="65"/>
+        </w:numPr>
+        <w:jc w:val="both"/>
+        <w:rPr>
+          <w:rFonts w:ascii="aptos" w:hAnsi="aptos"/>
+          <w:sz w:val="28"/>
+          <w:szCs w:val="28"/>
+        </w:rPr>
+      </w:pPr>
+      <w:r>
+        <w:rPr>
+          <w:rFonts w:ascii="aptos" w:hAnsi="aptos"/>
+          <w:sz w:val="28"/>
+          <w:szCs w:val="28"/>
+        </w:rPr>
+        <w:t>Only last interceptor is allowed to return result to the component.</w:t>
+      </w:r>
+    </w:p>
+    <w:p>
+      <w:pPr>
+        <w:pStyle w:val="TextBody"/>
+        <w:numPr>
+          <w:ilvl w:val="0"/>
+          <w:numId w:val="65"/>
+        </w:numPr>
+        <w:jc w:val="both"/>
+        <w:rPr>
+          <w:rFonts w:ascii="aptos" w:hAnsi="aptos"/>
+          <w:sz w:val="28"/>
+          <w:szCs w:val="28"/>
+        </w:rPr>
+      </w:pPr>
+      <w:r>
+        <w:rPr>
+          <w:rFonts w:ascii="aptos" w:hAnsi="aptos"/>
+          <w:sz w:val="28"/>
+          <w:szCs w:val="28"/>
+        </w:rPr>
+        <w:t>If 1</w:t>
+      </w:r>
+      <w:r>
+        <w:rPr>
+          <w:rFonts w:ascii="aptos" w:hAnsi="aptos"/>
+          <w:sz w:val="28"/>
+          <w:szCs w:val="28"/>
+          <w:vertAlign w:val="superscript"/>
+        </w:rPr>
+        <w:t>st</w:t>
+      </w:r>
+      <w:r>
+        <w:rPr>
+          <w:rFonts w:ascii="aptos" w:hAnsi="aptos"/>
+          <w:sz w:val="28"/>
+          <w:szCs w:val="28"/>
+        </w:rPr>
+        <w:t xml:space="preserve"> interceptor fails and occur an error then 2</w:t>
+      </w:r>
+      <w:r>
+        <w:rPr>
+          <w:rFonts w:ascii="aptos" w:hAnsi="aptos"/>
+          <w:sz w:val="28"/>
+          <w:szCs w:val="28"/>
+          <w:vertAlign w:val="superscript"/>
+        </w:rPr>
+        <w:t>nd</w:t>
+      </w:r>
+      <w:r>
+        <w:rPr>
+          <w:rFonts w:ascii="aptos" w:hAnsi="aptos"/>
+          <w:sz w:val="28"/>
+          <w:szCs w:val="28"/>
+        </w:rPr>
+        <w:t xml:space="preserve"> interceptor’s rejection part’s handler calls directly, it could not call response part of that interceptor.</w:t>
+      </w:r>
+    </w:p>
+    <w:p>
+      <w:pPr>
+        <w:pStyle w:val="TextBody"/>
+        <w:numPr>
+          <w:ilvl w:val="0"/>
+          <w:numId w:val="65"/>
+        </w:numPr>
+        <w:jc w:val="both"/>
+        <w:rPr>
+          <w:rFonts w:ascii="aptos" w:hAnsi="aptos"/>
+          <w:sz w:val="28"/>
+          <w:szCs w:val="28"/>
+        </w:rPr>
+      </w:pPr>
+      <w:r>
+        <w:rPr>
+          <w:rFonts w:ascii="aptos" w:hAnsi="aptos"/>
+          <w:sz w:val="28"/>
+          <w:szCs w:val="28"/>
+        </w:rPr>
+        <w:t>If interceptor 2 dont resolve the error then if interceptor 2 is the last iinterceptor then the error caught by the catch statement then show on the ui.</w:t>
+      </w:r>
+    </w:p>
+    <w:p>
+      <w:pPr>
+        <w:pStyle w:val="TextBody"/>
+        <w:numPr>
+          <w:ilvl w:val="0"/>
+          <w:numId w:val="65"/>
+        </w:numPr>
+        <w:jc w:val="both"/>
+        <w:rPr>
+          <w:rFonts w:ascii="aptos" w:hAnsi="aptos"/>
+          <w:sz w:val="28"/>
+          <w:szCs w:val="28"/>
+        </w:rPr>
+      </w:pPr>
+      <w:r>
+        <w:rPr>
+          <w:rFonts w:ascii="aptos" w:hAnsi="aptos"/>
+          <w:sz w:val="28"/>
+          <w:szCs w:val="28"/>
+        </w:rPr>
+        <w:t>If interceptor 2 can resolve the error, it resolve and if there is another interceptor 3 then it moves to the interceptor 3 success part otherwise the result returned and pass to the component.</w:t>
+      </w:r>
+    </w:p>
+    <w:p>
+      <w:pPr>
+        <w:pStyle w:val="TextBody"/>
+        <w:jc w:val="both"/>
+        <w:rPr>
+          <w:rFonts w:ascii="aptos" w:hAnsi="aptos"/>
+          <w:sz w:val="28"/>
+          <w:szCs w:val="28"/>
+        </w:rPr>
+      </w:pPr>
+      <w:r>
+        <w:rPr>
+          <w:rFonts w:ascii="aptos" w:hAnsi="aptos"/>
+          <w:sz w:val="28"/>
+          <w:szCs w:val="28"/>
+        </w:rPr>
+      </w:r>
+    </w:p>
+    <w:p>
+      <w:pPr>
+        <w:pStyle w:val="TextBody"/>
+        <w:jc w:val="both"/>
+        <w:rPr>
+          <w:rFonts w:ascii="aptos" w:hAnsi="aptos"/>
+          <w:sz w:val="28"/>
+          <w:szCs w:val="28"/>
+        </w:rPr>
+      </w:pPr>
+      <w:r>
+        <w:rPr>
+          <w:rFonts w:ascii="aptos" w:hAnsi="aptos"/>
+          <w:sz w:val="28"/>
+          <w:szCs w:val="28"/>
+        </w:rPr>
+        <w:t>2. for login functionality, what is server and client component between page.tsx and LoginForm.tsx?</w:t>
+      </w:r>
+    </w:p>
+    <w:p>
+      <w:pPr>
+        <w:pStyle w:val="TextBody"/>
+        <w:jc w:val="both"/>
+        <w:rPr>
+          <w:rFonts w:ascii="aptos" w:hAnsi="aptos"/>
+          <w:sz w:val="28"/>
+          <w:szCs w:val="28"/>
+        </w:rPr>
+      </w:pPr>
+      <w:r>
+        <w:rPr>
+          <w:rFonts w:ascii="aptos" w:hAnsi="aptos"/>
+          <w:sz w:val="28"/>
+          <w:szCs w:val="28"/>
+        </w:rPr>
+        <w:t>Ans: Page.tsx must be server component and LoginForm.tsx is client component only manage the data entered from the user and set the states of mail and password.</w:t>
+      </w:r>
+    </w:p>
+    <w:p>
+      <w:pPr>
+        <w:pStyle w:val="TextBody"/>
+        <w:jc w:val="both"/>
+        <w:rPr>
+          <w:rFonts w:ascii="aptos" w:hAnsi="aptos"/>
+          <w:sz w:val="28"/>
+          <w:szCs w:val="28"/>
+        </w:rPr>
+      </w:pPr>
+      <w:r>
+        <w:rPr>
+          <w:rFonts w:ascii="aptos" w:hAnsi="aptos"/>
+          <w:sz w:val="28"/>
+          <w:szCs w:val="28"/>
+        </w:rPr>
+        <w:t>Then in the specific LoginForm folder, we can create a file named action.ts where we can perform server side action and error message from backend can also render from here.</w:t>
+      </w:r>
+    </w:p>
+    <w:p>
+      <w:pPr>
+        <w:pStyle w:val="TextBody"/>
+        <w:jc w:val="both"/>
+        <w:rPr>
+          <w:rFonts w:ascii="aptos" w:hAnsi="aptos"/>
+          <w:sz w:val="28"/>
+          <w:szCs w:val="28"/>
+        </w:rPr>
+      </w:pPr>
+      <w:r>
+        <w:rPr>
+          <w:rFonts w:ascii="aptos" w:hAnsi="aptos"/>
+          <w:sz w:val="28"/>
+          <w:szCs w:val="28"/>
+        </w:rPr>
+        <w:t>3. Library for date selector and cannot select the old date?</w:t>
+      </w:r>
+    </w:p>
+    <w:p>
+      <w:pPr>
+        <w:pStyle w:val="TextBody"/>
+        <w:jc w:val="both"/>
+        <w:rPr>
+          <w:rFonts w:ascii="aptos" w:hAnsi="aptos"/>
+          <w:sz w:val="28"/>
+          <w:szCs w:val="28"/>
+        </w:rPr>
+      </w:pPr>
+      <w:r>
+        <w:rPr>
+          <w:rFonts w:ascii="aptos" w:hAnsi="aptos"/>
+          <w:sz w:val="28"/>
+          <w:szCs w:val="28"/>
+        </w:rPr>
+        <w:t>Ans: MUI library:</w:t>
+      </w:r>
+    </w:p>
+    <w:p>
+      <w:pPr>
+        <w:pStyle w:val="TextBody"/>
+        <w:jc w:val="both"/>
+        <w:rPr>
+          <w:rFonts w:ascii="aptos" w:hAnsi="aptos"/>
+          <w:sz w:val="28"/>
+          <w:szCs w:val="28"/>
+        </w:rPr>
+      </w:pPr>
+      <w:r>
+        <w:rPr>
+          <w:rFonts w:ascii="aptos" w:hAnsi="aptos"/>
+          <w:sz w:val="28"/>
+          <w:szCs w:val="28"/>
+        </w:rPr>
+        <w:tab/>
+        <w:t>&lt;DatePicker label="Select date" disablePast /&gt;</w:t>
+      </w:r>
+    </w:p>
+    <w:p>
+      <w:pPr>
+        <w:pStyle w:val="TextBody"/>
+        <w:numPr>
+          <w:ilvl w:val="0"/>
+          <w:numId w:val="68"/>
+        </w:numPr>
+        <w:jc w:val="both"/>
+        <w:rPr>
+          <w:rFonts w:ascii="aptos" w:hAnsi="aptos"/>
+          <w:sz w:val="28"/>
+          <w:szCs w:val="28"/>
+        </w:rPr>
+      </w:pPr>
+      <w:r>
+        <w:rPr>
+          <w:rFonts w:ascii="aptos" w:hAnsi="aptos"/>
+          <w:sz w:val="28"/>
+          <w:szCs w:val="28"/>
+        </w:rPr>
+        <w:t>React Date picker</w:t>
+      </w:r>
+    </w:p>
+    <w:p>
+      <w:pPr>
+        <w:pStyle w:val="TextBody"/>
+        <w:ind w:left="720" w:hanging="0"/>
+        <w:jc w:val="both"/>
+        <w:rPr>
+          <w:rFonts w:ascii="aptos" w:hAnsi="aptos"/>
+          <w:sz w:val="28"/>
+          <w:szCs w:val="28"/>
+        </w:rPr>
+      </w:pPr>
+      <w:r>
+        <w:rPr>
+          <w:rFonts w:ascii="aptos" w:hAnsi="aptos"/>
+          <w:sz w:val="28"/>
+          <w:szCs w:val="28"/>
+        </w:rPr>
+        <w:t>&lt;DatePicker minDate = {new Date()}/&gt;</w:t>
+      </w:r>
+    </w:p>
+    <w:p>
+      <w:pPr>
+        <w:pStyle w:val="TextBody"/>
+        <w:numPr>
+          <w:ilvl w:val="0"/>
+          <w:numId w:val="68"/>
+        </w:numPr>
+        <w:jc w:val="both"/>
+        <w:rPr>
+          <w:rFonts w:ascii="aptos" w:hAnsi="aptos"/>
+          <w:sz w:val="28"/>
+          <w:szCs w:val="28"/>
+        </w:rPr>
+      </w:pPr>
+      <w:r>
+        <w:rPr>
+          <w:rFonts w:ascii="aptos" w:hAnsi="aptos"/>
+          <w:sz w:val="28"/>
+          <w:szCs w:val="28"/>
+        </w:rPr>
+        <w:t>Mantine datepicker</w:t>
+      </w:r>
+    </w:p>
+    <w:p>
+      <w:pPr>
+        <w:pStyle w:val="TextBody"/>
+        <w:ind w:firstLine="720"/>
+        <w:jc w:val="both"/>
+        <w:rPr>
+          <w:rFonts w:ascii="aptos" w:hAnsi="aptos"/>
+          <w:sz w:val="28"/>
+          <w:szCs w:val="28"/>
+        </w:rPr>
+      </w:pPr>
+      <w:r>
+        <w:rPr>
+          <w:rFonts w:ascii="aptos" w:hAnsi="aptos"/>
+          <w:sz w:val="28"/>
+          <w:szCs w:val="28"/>
+        </w:rPr>
+        <w:t>&lt;DatePicker minDate = {new Date()}/&gt;</w:t>
+      </w:r>
+    </w:p>
+    <w:p>
+      <w:pPr>
+        <w:pStyle w:val="TextBody"/>
+        <w:numPr>
+          <w:ilvl w:val="0"/>
+          <w:numId w:val="68"/>
+        </w:numPr>
+        <w:jc w:val="both"/>
+        <w:rPr>
+          <w:rFonts w:ascii="aptos" w:hAnsi="aptos"/>
+          <w:sz w:val="28"/>
+          <w:szCs w:val="28"/>
+        </w:rPr>
+      </w:pPr>
+      <w:r>
+        <w:rPr>
+          <w:rFonts w:ascii="aptos" w:hAnsi="aptos"/>
+          <w:sz w:val="28"/>
+          <w:szCs w:val="28"/>
+        </w:rPr>
+        <w:t>React Day picker</w:t>
+      </w:r>
+    </w:p>
+    <w:p>
+      <w:pPr>
+        <w:pStyle w:val="TextBody"/>
+        <w:ind w:left="720" w:hanging="0"/>
+        <w:jc w:val="both"/>
+        <w:rPr>
+          <w:rFonts w:ascii="aptos" w:hAnsi="aptos"/>
+          <w:sz w:val="28"/>
+          <w:szCs w:val="28"/>
+        </w:rPr>
+      </w:pPr>
+      <w:r>
+        <w:rPr>
+          <w:rFonts w:ascii="aptos" w:hAnsi="aptos"/>
+          <w:sz w:val="28"/>
+          <w:szCs w:val="28"/>
+        </w:rPr>
+        <w:t>&lt;DayPicker disabled={{ before: new Date() }} /&gt;</w:t>
+      </w:r>
+    </w:p>
+    <w:p>
+      <w:pPr>
+        <w:pStyle w:val="TextBody"/>
+        <w:ind w:left="720" w:hanging="0"/>
+        <w:jc w:val="both"/>
+        <w:rPr>
+          <w:rFonts w:ascii="aptos" w:hAnsi="aptos"/>
+          <w:sz w:val="28"/>
+          <w:szCs w:val="28"/>
+        </w:rPr>
+      </w:pPr>
+      <w:r>
+        <w:rPr>
+          <w:rFonts w:ascii="aptos" w:hAnsi="aptos"/>
+          <w:sz w:val="28"/>
+          <w:szCs w:val="28"/>
+        </w:rPr>
+      </w:r>
+    </w:p>
+    <w:p>
+      <w:pPr>
+        <w:pStyle w:val="TextBody"/>
+        <w:jc w:val="both"/>
+        <w:rPr>
+          <w:rFonts w:ascii="aptos" w:hAnsi="aptos"/>
+          <w:sz w:val="28"/>
+          <w:szCs w:val="28"/>
+        </w:rPr>
+      </w:pPr>
+      <w:r>
+        <w:rPr>
+          <w:rFonts w:ascii="aptos" w:hAnsi="aptos"/>
+          <w:sz w:val="28"/>
+          <w:szCs w:val="28"/>
+        </w:rPr>
+        <w:t>4. How to fix the size of textarea field without drag option?</w:t>
+      </w:r>
+    </w:p>
+    <w:p>
+      <w:pPr>
+        <w:pStyle w:val="TextBody"/>
+        <w:jc w:val="both"/>
+        <w:rPr>
+          <w:rFonts w:ascii="aptos" w:hAnsi="aptos"/>
+          <w:sz w:val="28"/>
+          <w:szCs w:val="28"/>
+        </w:rPr>
+      </w:pPr>
+      <w:r>
+        <w:rPr>
+          <w:rFonts w:ascii="aptos" w:hAnsi="aptos"/>
+          <w:sz w:val="28"/>
+          <w:szCs w:val="28"/>
+        </w:rPr>
+        <w:t>Ans: Give height and widht / row and column property for size.</w:t>
+      </w:r>
+    </w:p>
+    <w:p>
+      <w:pPr>
+        <w:pStyle w:val="TextBody"/>
+        <w:numPr>
+          <w:ilvl w:val="0"/>
+          <w:numId w:val="66"/>
+        </w:numPr>
+        <w:jc w:val="both"/>
+        <w:rPr>
+          <w:rFonts w:ascii="aptos" w:hAnsi="aptos"/>
+          <w:sz w:val="28"/>
+          <w:szCs w:val="28"/>
+        </w:rPr>
+      </w:pPr>
+      <w:r>
+        <w:rPr>
+          <w:rFonts w:ascii="aptos" w:hAnsi="aptos"/>
+          <w:sz w:val="28"/>
+          <w:szCs w:val="28"/>
+        </w:rPr>
+        <w:t>Then give resize – none :- it fix the size we given and do not show the drag text area box.</w:t>
+      </w:r>
+    </w:p>
+    <w:p>
+      <w:pPr>
+        <w:pStyle w:val="TextBody"/>
+        <w:numPr>
+          <w:ilvl w:val="0"/>
+          <w:numId w:val="66"/>
+        </w:numPr>
+        <w:jc w:val="both"/>
+        <w:rPr>
+          <w:rFonts w:ascii="aptos" w:hAnsi="aptos"/>
+          <w:sz w:val="28"/>
+          <w:szCs w:val="28"/>
+        </w:rPr>
+      </w:pPr>
+      <w:r>
+        <w:rPr>
+          <w:rFonts w:ascii="aptos" w:hAnsi="aptos"/>
+          <w:sz w:val="28"/>
+          <w:szCs w:val="28"/>
+        </w:rPr>
+        <w:t>&lt;textarea placeholder="Write here.." className=" w-full h-20 resize-none "/&gt;</w:t>
+      </w:r>
+    </w:p>
+    <w:p>
+      <w:pPr>
+        <w:pStyle w:val="TextBody"/>
+        <w:jc w:val="both"/>
+        <w:rPr>
+          <w:rFonts w:ascii="aptos" w:hAnsi="aptos"/>
+          <w:sz w:val="28"/>
+          <w:szCs w:val="28"/>
+        </w:rPr>
+      </w:pPr>
+      <w:r>
+        <w:rPr>
+          <w:rFonts w:ascii="aptos" w:hAnsi="aptos"/>
+          <w:sz w:val="28"/>
+          <w:szCs w:val="28"/>
+        </w:rPr>
+      </w:r>
+    </w:p>
+    <w:p>
+      <w:pPr>
+        <w:pStyle w:val="TextBody"/>
+        <w:jc w:val="both"/>
+        <w:rPr>
+          <w:rFonts w:ascii="aptos" w:hAnsi="aptos"/>
+          <w:sz w:val="28"/>
+          <w:szCs w:val="28"/>
+        </w:rPr>
+      </w:pPr>
+      <w:r>
+        <w:rPr>
+          <w:rFonts w:ascii="aptos" w:hAnsi="aptos"/>
+          <w:sz w:val="28"/>
+          <w:szCs w:val="28"/>
+        </w:rPr>
+        <w:t>5. If server send the error, then how can we show the custom error on the ui?</w:t>
+      </w:r>
+    </w:p>
+    <w:p>
+      <w:pPr>
+        <w:pStyle w:val="TextBody"/>
+        <w:jc w:val="both"/>
+        <w:rPr>
+          <w:rFonts w:ascii="aptos" w:hAnsi="aptos"/>
+          <w:sz w:val="28"/>
+          <w:szCs w:val="28"/>
+        </w:rPr>
+      </w:pPr>
+      <w:r>
+        <w:rPr>
+          <w:rFonts w:ascii="aptos" w:hAnsi="aptos"/>
+          <w:sz w:val="28"/>
+          <w:szCs w:val="28"/>
+        </w:rPr>
+        <w:t xml:space="preserve">Ans: </w:t>
+      </w:r>
+      <w:r>
+        <w:rPr>
+          <w:rFonts w:ascii="aptos" w:hAnsi="aptos"/>
+          <w:sz w:val="28"/>
+          <w:szCs w:val="28"/>
+        </w:rPr>
+        <w:t>for customize the specific error message, we can compare it with the status code if(error.response.</w:t>
+      </w:r>
+      <w:r>
+        <w:rPr>
+          <w:rFonts w:ascii="aptos" w:hAnsi="aptos"/>
+          <w:sz w:val="28"/>
+          <w:szCs w:val="28"/>
+        </w:rPr>
+        <w:t>status === 400</w:t>
+      </w:r>
+      <w:r>
+        <w:rPr>
+          <w:rFonts w:ascii="aptos" w:hAnsi="aptos"/>
+          <w:sz w:val="28"/>
+          <w:szCs w:val="28"/>
+        </w:rPr>
+        <w:t>)</w:t>
+      </w:r>
+      <w:r>
+        <w:rPr>
+          <w:rFonts w:ascii="aptos" w:hAnsi="aptos"/>
+          <w:sz w:val="28"/>
+          <w:szCs w:val="28"/>
+        </w:rPr>
+        <w:t xml:space="preserve">  </w:t>
+      </w:r>
+      <w:r>
+        <w:rPr>
+          <w:rFonts w:ascii="aptos" w:hAnsi="aptos"/>
+          <w:sz w:val="28"/>
+          <w:szCs w:val="28"/>
+        </w:rPr>
+        <w:t>and simply return the cutomize error we want to print.</w:t>
+      </w:r>
+    </w:p>
+    <w:p>
+      <w:pPr>
+        <w:pStyle w:val="TextBody"/>
+        <w:numPr>
+          <w:ilvl w:val="0"/>
+          <w:numId w:val="70"/>
+        </w:numPr>
+        <w:jc w:val="both"/>
+        <w:rPr>
+          <w:rFonts w:ascii="aptos" w:hAnsi="aptos"/>
+          <w:sz w:val="28"/>
+          <w:szCs w:val="28"/>
+        </w:rPr>
+      </w:pPr>
+      <w:r>
+        <w:rPr>
+          <w:rFonts w:ascii="aptos" w:hAnsi="aptos"/>
+          <w:sz w:val="28"/>
+          <w:szCs w:val="28"/>
+        </w:rPr>
+        <w:t>For specific field, we can access this field by error.response.data.field then we return the error.</w:t>
+      </w:r>
+    </w:p>
+    <w:p>
+      <w:pPr>
+        <w:pStyle w:val="TextBody"/>
+        <w:jc w:val="both"/>
+        <w:rPr>
+          <w:rFonts w:ascii="aptos" w:hAnsi="aptos"/>
+          <w:sz w:val="28"/>
+          <w:szCs w:val="28"/>
+        </w:rPr>
+      </w:pPr>
+      <w:r>
+        <w:rPr>
+          <w:rFonts w:ascii="aptos" w:hAnsi="aptos"/>
+          <w:sz w:val="28"/>
+          <w:szCs w:val="28"/>
+        </w:rPr>
+      </w:r>
+    </w:p>
+    <w:p>
+      <w:pPr>
+        <w:pStyle w:val="TextBody"/>
+        <w:jc w:val="both"/>
+        <w:rPr>
+          <w:rFonts w:ascii="aptos" w:hAnsi="aptos"/>
+          <w:sz w:val="28"/>
+          <w:szCs w:val="28"/>
+        </w:rPr>
+      </w:pPr>
+      <w:r>
+        <w:rPr>
+          <w:rFonts w:ascii="aptos" w:hAnsi="aptos"/>
+          <w:sz w:val="28"/>
+          <w:szCs w:val="28"/>
+        </w:rPr>
+      </w:r>
+    </w:p>
+    <w:p>
+      <w:pPr>
+        <w:pStyle w:val="TextBody"/>
+        <w:jc w:val="both"/>
+        <w:rPr>
+          <w:rFonts w:ascii="aptos" w:hAnsi="aptos"/>
+          <w:sz w:val="28"/>
+          <w:szCs w:val="28"/>
+        </w:rPr>
+      </w:pPr>
+      <w:r>
+        <w:rPr>
+          <w:rFonts w:ascii="aptos" w:hAnsi="aptos"/>
+          <w:sz w:val="28"/>
+          <w:szCs w:val="28"/>
+        </w:rPr>
+      </w:r>
+    </w:p>
+    <w:p>
+      <w:pPr>
+        <w:pStyle w:val="TextBody"/>
+        <w:jc w:val="both"/>
+        <w:rPr>
+          <w:rFonts w:ascii="aptos" w:hAnsi="aptos"/>
+          <w:sz w:val="28"/>
+          <w:szCs w:val="28"/>
+        </w:rPr>
+      </w:pPr>
+      <w:r>
+        <w:rPr>
+          <w:rFonts w:ascii="aptos" w:hAnsi="aptos"/>
+          <w:sz w:val="28"/>
+          <w:szCs w:val="28"/>
+        </w:rPr>
+      </w:r>
+    </w:p>
+    <w:p>
+      <w:pPr>
+        <w:pStyle w:val="TextBody"/>
+        <w:jc w:val="both"/>
+        <w:rPr>
+          <w:rFonts w:ascii="aptos" w:hAnsi="aptos"/>
+          <w:sz w:val="28"/>
+          <w:szCs w:val="28"/>
+        </w:rPr>
+      </w:pPr>
+      <w:r>
+        <w:rPr>
+          <w:rFonts w:ascii="aptos" w:hAnsi="aptos"/>
+          <w:sz w:val="28"/>
+          <w:szCs w:val="28"/>
+        </w:rPr>
+      </w:r>
+    </w:p>
+    <w:p>
+      <w:pPr>
+        <w:pStyle w:val="TextBody"/>
+        <w:jc w:val="both"/>
+        <w:rPr>
+          <w:rFonts w:ascii="aptos" w:hAnsi="aptos"/>
+          <w:sz w:val="28"/>
+          <w:szCs w:val="28"/>
+        </w:rPr>
+      </w:pPr>
+      <w:r>
+        <w:rPr>
+          <w:rFonts w:ascii="aptos" w:hAnsi="aptos"/>
+          <w:sz w:val="28"/>
+          <w:szCs w:val="28"/>
+        </w:rPr>
+        <w:t>6. If url query params have extra space.</w:t>
+      </w:r>
+    </w:p>
+    <w:p>
+      <w:pPr>
+        <w:pStyle w:val="TextBody"/>
+        <w:jc w:val="both"/>
+        <w:rPr/>
+      </w:pPr>
+      <w:r>
+        <w:rPr>
+          <w:rFonts w:ascii="aptos" w:hAnsi="aptos"/>
+          <w:sz w:val="28"/>
+          <w:szCs w:val="28"/>
+        </w:rPr>
+        <w:t>Ans: If we add a extra space, then pace character in a URL query string is encoded as %</w:t>
+      </w:r>
+      <w:r>
+        <w:rPr>
+          <w:rFonts w:ascii="aptos" w:hAnsi="aptos"/>
+          <w:sz w:val="28"/>
+          <w:szCs w:val="28"/>
+        </w:rPr>
+        <w:t>20 or +.</w:t>
+      </w:r>
+    </w:p>
+    <w:p>
+      <w:pPr>
+        <w:pStyle w:val="TextBody"/>
+        <w:numPr>
+          <w:ilvl w:val="0"/>
+          <w:numId w:val="67"/>
+        </w:numPr>
+        <w:jc w:val="both"/>
+        <w:rPr/>
+      </w:pPr>
+      <w:r>
+        <w:rPr>
+          <w:rStyle w:val="SourceText"/>
+          <w:rFonts w:ascii="aptos" w:hAnsi="aptos"/>
+          <w:sz w:val="28"/>
+          <w:szCs w:val="28"/>
+          <w:bdr w:val="single" w:sz="6" w:space="1" w:color="F0F2F5"/>
+        </w:rPr>
+        <w:t>The page loads mormally and the space does not crash the browser.</w:t>
+      </w:r>
+    </w:p>
+    <w:p>
+      <w:pPr>
+        <w:pStyle w:val="TextBody"/>
+        <w:numPr>
+          <w:ilvl w:val="0"/>
+          <w:numId w:val="67"/>
+        </w:numPr>
+        <w:jc w:val="both"/>
+        <w:rPr/>
+      </w:pPr>
+      <w:r>
+        <w:rPr>
+          <w:rStyle w:val="SourceText"/>
+          <w:rFonts w:ascii="aptos" w:hAnsi="aptos"/>
+          <w:sz w:val="28"/>
+          <w:szCs w:val="28"/>
+          <w:bdr w:val="single" w:sz="6" w:space="1" w:color="F0F2F5"/>
+        </w:rPr>
+        <w:t>When the url paste on the browser then the browser automatically add %20 or + instead of space.</w:t>
+      </w:r>
+    </w:p>
+    <w:p>
+      <w:pPr>
+        <w:pStyle w:val="TextBody"/>
+        <w:numPr>
+          <w:ilvl w:val="0"/>
+          <w:numId w:val="67"/>
+        </w:numPr>
+        <w:jc w:val="both"/>
+        <w:rPr/>
+      </w:pPr>
+      <w:r>
+        <w:rPr>
+          <w:rStyle w:val="SourceText"/>
+          <w:rFonts w:ascii="aptos" w:hAnsi="aptos"/>
+          <w:sz w:val="28"/>
+          <w:szCs w:val="28"/>
+          <w:bdr w:val="single" w:sz="6" w:space="1" w:color="F0F2F5"/>
+        </w:rPr>
+        <w:t>server catch the url and looks at the endpoint /task and understand that load the task page route.</w:t>
+      </w:r>
+    </w:p>
+    <w:p>
+      <w:pPr>
+        <w:pStyle w:val="TextBody"/>
+        <w:numPr>
+          <w:ilvl w:val="0"/>
+          <w:numId w:val="67"/>
+        </w:numPr>
+        <w:jc w:val="both"/>
+        <w:rPr/>
+      </w:pPr>
+      <w:r>
+        <w:rPr>
+          <w:rStyle w:val="SourceText"/>
+          <w:rFonts w:ascii="aptos" w:hAnsi="aptos"/>
+          <w:sz w:val="28"/>
+          <w:szCs w:val="28"/>
+          <w:bdr w:val="single" w:sz="6" w:space="1" w:color="F0F2F5"/>
+        </w:rPr>
+        <w:t>Then server looks at the query parameters of the url and splits them using the &amp; symbol.</w:t>
+      </w:r>
+    </w:p>
+    <w:p>
+      <w:pPr>
+        <w:pStyle w:val="TextBody"/>
+        <w:numPr>
+          <w:ilvl w:val="0"/>
+          <w:numId w:val="67"/>
+        </w:numPr>
+        <w:jc w:val="both"/>
+        <w:rPr/>
+      </w:pPr>
+      <w:r>
+        <w:rPr>
+          <w:rStyle w:val="SourceText"/>
+          <w:rFonts w:ascii="aptos" w:hAnsi="aptos"/>
+          <w:sz w:val="28"/>
+          <w:szCs w:val="28"/>
+          <w:bdr w:val="single" w:sz="6" w:space="1" w:color="F0F2F5"/>
+        </w:rPr>
+        <w:t>Then it convert “%20” to space. Afer this, the key become “ search”.</w:t>
+      </w:r>
+    </w:p>
+    <w:p>
+      <w:pPr>
+        <w:pStyle w:val="TextBody"/>
+        <w:numPr>
+          <w:ilvl w:val="0"/>
+          <w:numId w:val="67"/>
+        </w:numPr>
+        <w:jc w:val="both"/>
+        <w:rPr/>
+      </w:pPr>
+      <w:r>
+        <w:rPr>
+          <w:rStyle w:val="SourceText"/>
+          <w:rFonts w:ascii="aptos" w:hAnsi="aptos"/>
+          <w:sz w:val="28"/>
+          <w:szCs w:val="28"/>
+          <w:bdr w:val="single" w:sz="6" w:space="1" w:color="F0F2F5"/>
+        </w:rPr>
+        <w:t>Then because of the space the search filters in ignored and if backend have strict validation then it give the 400 – Bad request.</w:t>
+      </w:r>
+    </w:p>
+    <w:p>
+      <w:pPr>
+        <w:pStyle w:val="TextBody"/>
+        <w:jc w:val="both"/>
+        <w:rPr>
+          <w:rFonts w:ascii="aptos" w:hAnsi="aptos" w:eastAsia="Aptos" w:cs="DejaVu Sans"/>
+          <w:sz w:val="28"/>
+          <w:szCs w:val="28"/>
+        </w:rPr>
+      </w:pPr>
+      <w:r>
+        <w:rPr>
+          <w:rFonts w:eastAsia="Aptos" w:cs="DejaVu Sans" w:ascii="aptos" w:hAnsi="aptos"/>
+          <w:sz w:val="28"/>
+          <w:szCs w:val="28"/>
+        </w:rPr>
+      </w:r>
+    </w:p>
+    <w:p>
+      <w:pPr>
+        <w:pStyle w:val="TextBody"/>
+        <w:jc w:val="both"/>
+        <w:rPr/>
+      </w:pPr>
+      <w:r>
+        <w:rPr>
+          <w:rStyle w:val="SourceText"/>
+          <w:rFonts w:eastAsia="Aptos" w:cs="DejaVu Sans" w:ascii="aptos" w:hAnsi="aptos"/>
+          <w:sz w:val="28"/>
+          <w:szCs w:val="28"/>
+        </w:rPr>
+        <w:t>7. Handling disable button by using single useState?</w:t>
+      </w:r>
+    </w:p>
+    <w:p>
+      <w:pPr>
+        <w:pStyle w:val="TextBody"/>
+        <w:jc w:val="both"/>
+        <w:rPr/>
+      </w:pPr>
+      <w:r>
+        <w:rPr>
+          <w:rStyle w:val="SourceText"/>
+          <w:rFonts w:eastAsia="Aptos" w:cs="DejaVu Sans" w:ascii="aptos" w:hAnsi="aptos"/>
+          <w:sz w:val="28"/>
+          <w:szCs w:val="28"/>
+        </w:rPr>
+        <w:t>Ans: We can set a useState hook and make different method for different buttons.</w:t>
+      </w:r>
+    </w:p>
+    <w:p>
+      <w:pPr>
+        <w:pStyle w:val="TextBody"/>
+        <w:jc w:val="both"/>
+        <w:rPr/>
+      </w:pPr>
+      <w:r>
+        <w:rPr>
+          <w:rStyle w:val="SourceText"/>
+          <w:rFonts w:eastAsia="Aptos" w:cs="DejaVu Sans" w:ascii="aptos" w:hAnsi="aptos"/>
+          <w:sz w:val="28"/>
+          <w:szCs w:val="28"/>
+        </w:rPr>
+        <w:t>Then first set the valid message related to action perform by the button in the setter method of useState.</w:t>
+      </w:r>
+    </w:p>
+    <w:p>
+      <w:pPr>
+        <w:pStyle w:val="TextBody"/>
+        <w:jc w:val="both"/>
+        <w:rPr/>
+      </w:pPr>
+      <w:r>
+        <w:rPr>
+          <w:rStyle w:val="SourceText"/>
+          <w:rFonts w:eastAsia="Aptos" w:cs="DejaVu Sans" w:ascii="aptos" w:hAnsi="aptos"/>
+          <w:sz w:val="28"/>
+          <w:szCs w:val="28"/>
+        </w:rPr>
+        <w:t>At last in function, also null the useState hook by finally.</w:t>
+      </w:r>
+    </w:p>
+    <w:p>
+      <w:pPr>
+        <w:pStyle w:val="TextBody"/>
+        <w:jc w:val="both"/>
+        <w:rPr/>
+      </w:pPr>
+      <w:r>
+        <w:rPr>
+          <w:rStyle w:val="SourceText"/>
+          <w:rFonts w:eastAsia="Aptos" w:cs="DejaVu Sans" w:ascii="aptos" w:hAnsi="aptos"/>
+          <w:sz w:val="28"/>
+          <w:szCs w:val="28"/>
+        </w:rPr>
+        <w:t>Then simply onClick = {handleDelete} then apply disabled = {isLoading === “delete”}</w:t>
+      </w:r>
+    </w:p>
+    <w:p>
+      <w:pPr>
+        <w:pStyle w:val="TextBody"/>
+        <w:jc w:val="both"/>
+        <w:rPr/>
+      </w:pPr>
+      <w:r>
+        <w:rPr>
+          <w:rStyle w:val="SourceText"/>
+          <w:rFonts w:eastAsia="Aptos" w:cs="DejaVu Sans" w:ascii="aptos" w:hAnsi="aptos"/>
+          <w:sz w:val="28"/>
+          <w:szCs w:val="28"/>
+        </w:rPr>
+        <w:t xml:space="preserve">And {isLoading === “delete” ? “Deleting…” : “Delete”} </w:t>
+      </w:r>
+    </w:p>
+    <w:p>
+      <w:pPr>
+        <w:pStyle w:val="TextBody"/>
+        <w:jc w:val="both"/>
+        <w:rPr>
+          <w:rStyle w:val="SourceText"/>
+          <w:rFonts w:ascii="aptos" w:hAnsi="aptos" w:eastAsia="Aptos" w:cs="DejaVu Sans"/>
+          <w:sz w:val="28"/>
+          <w:szCs w:val="28"/>
+        </w:rPr>
+      </w:pPr>
+      <w:r>
+        <w:rPr/>
+      </w:r>
+    </w:p>
+    <w:p>
+      <w:pPr>
+        <w:pStyle w:val="TextBody"/>
+        <w:jc w:val="both"/>
+        <w:rPr>
+          <w:rStyle w:val="SourceText"/>
+          <w:rFonts w:ascii="aptos" w:hAnsi="aptos" w:eastAsia="Aptos" w:cs="DejaVu Sans"/>
+          <w:sz w:val="28"/>
+          <w:szCs w:val="28"/>
+        </w:rPr>
+      </w:pPr>
+      <w:r>
+        <w:rPr/>
+      </w:r>
+    </w:p>
+    <w:p>
+      <w:pPr>
+        <w:pStyle w:val="TextBody"/>
+        <w:jc w:val="both"/>
+        <w:rPr/>
+      </w:pPr>
+      <w:r>
+        <w:rPr>
+          <w:rStyle w:val="SourceText"/>
+          <w:rFonts w:eastAsia="Aptos" w:cs="DejaVu Sans" w:ascii="aptos" w:hAnsi="aptos"/>
+          <w:sz w:val="28"/>
+          <w:szCs w:val="28"/>
+        </w:rPr>
+        <w:t>8. How to show updated task list without reload/ refetch?</w:t>
+      </w:r>
+    </w:p>
+    <w:p>
+      <w:pPr>
+        <w:pStyle w:val="TextBody"/>
+        <w:jc w:val="both"/>
+        <w:rPr/>
+      </w:pPr>
+      <w:r>
+        <w:rPr>
+          <w:rStyle w:val="SourceText"/>
+          <w:rFonts w:eastAsia="Aptos" w:cs="DejaVu Sans" w:ascii="aptos" w:hAnsi="aptos"/>
+          <w:sz w:val="28"/>
+          <w:szCs w:val="28"/>
+        </w:rPr>
+        <w:t>Ans: after catching the error and show the message to the user, in catch we can filter the task list so it show the updated list after catching the error.</w:t>
+      </w:r>
+    </w:p>
+    <w:p>
+      <w:pPr>
+        <w:pStyle w:val="TextBody"/>
+        <w:numPr>
+          <w:ilvl w:val="0"/>
+          <w:numId w:val="69"/>
+        </w:numPr>
+        <w:jc w:val="both"/>
+        <w:rPr/>
+      </w:pPr>
+      <w:r>
+        <w:rPr>
+          <w:rStyle w:val="SourceText"/>
+          <w:rFonts w:eastAsia="Aptos" w:cs="DejaVu Sans" w:ascii="aptos" w:hAnsi="aptos"/>
+          <w:sz w:val="28"/>
+          <w:szCs w:val="28"/>
+        </w:rPr>
+        <w:t xml:space="preserve">In catch block, </w:t>
+      </w:r>
+      <w:r>
+        <w:rPr>
+          <w:rStyle w:val="SourceText"/>
+          <w:rFonts w:eastAsia="Aptos" w:cs="DejaVu Sans" w:ascii="aptos" w:hAnsi="aptos"/>
+          <w:sz w:val="28"/>
+          <w:szCs w:val="28"/>
+        </w:rPr>
+        <w:t>we set the filter for the specific error (404-not found)</w:t>
+      </w:r>
+    </w:p>
+    <w:p>
+      <w:pPr>
+        <w:pStyle w:val="TextBody"/>
+        <w:numPr>
+          <w:ilvl w:val="0"/>
+          <w:numId w:val="69"/>
+        </w:numPr>
+        <w:jc w:val="left"/>
+        <w:rPr/>
+      </w:pPr>
+      <w:r>
+        <w:rPr>
+          <w:rStyle w:val="SourceText"/>
+          <w:rFonts w:eastAsia="Aptos" w:cs="DejaVu Sans" w:ascii="aptos" w:hAnsi="aptos"/>
+          <w:sz w:val="28"/>
+          <w:szCs w:val="28"/>
+        </w:rPr>
+        <w:t>setTasks(currentTasks =&gt; currentTasks.filter(task =&gt; task.id !== clickedTaskId));</w:t>
+      </w:r>
+    </w:p>
+    <w:p>
+      <w:pPr>
+        <w:pStyle w:val="TextBody"/>
+        <w:jc w:val="both"/>
+        <w:rPr>
+          <w:rFonts w:ascii="aptos" w:hAnsi="aptos"/>
+          <w:sz w:val="28"/>
+          <w:szCs w:val="28"/>
+        </w:rPr>
+      </w:pPr>
+      <w:r>
+        <w:rPr>
+          <w:rFonts w:ascii="aptos" w:hAnsi="aptos"/>
+          <w:sz w:val="28"/>
+          <w:szCs w:val="28"/>
+        </w:rPr>
+      </w:r>
+    </w:p>
+    <w:p>
+      <w:pPr>
+        <w:pStyle w:val="TextBody"/>
+        <w:jc w:val="both"/>
+        <w:rPr>
+          <w:rFonts w:ascii="aptos" w:hAnsi="aptos"/>
+          <w:sz w:val="28"/>
+          <w:szCs w:val="28"/>
+        </w:rPr>
+      </w:pPr>
+      <w:r>
+        <w:rPr>
+          <w:rFonts w:ascii="aptos" w:hAnsi="aptos"/>
+          <w:sz w:val="28"/>
+          <w:szCs w:val="28"/>
+        </w:rPr>
+        <w:t>9. Page navigation survive.</w:t>
+      </w:r>
+    </w:p>
+    <w:p>
+      <w:pPr>
+        <w:pStyle w:val="TextBody"/>
+        <w:jc w:val="both"/>
+        <w:rPr/>
+      </w:pPr>
+      <w:r>
+        <w:rPr>
+          <w:rFonts w:ascii="aptos" w:hAnsi="aptos"/>
+          <w:sz w:val="28"/>
+          <w:szCs w:val="28"/>
+        </w:rPr>
+        <w:t xml:space="preserve">Ans: </w:t>
+      </w:r>
+      <w:r>
+        <w:rPr>
+          <w:rFonts w:ascii="aptos" w:hAnsi="aptos"/>
+          <w:sz w:val="28"/>
+          <w:szCs w:val="28"/>
+        </w:rPr>
+        <w:t>we can store the filtered data in local storage and then we can get the filtered data while page navigation.</w:t>
+      </w:r>
+    </w:p>
+    <w:p>
+      <w:pPr>
+        <w:pStyle w:val="TextBody"/>
+        <w:numPr>
+          <w:ilvl w:val="0"/>
+          <w:numId w:val="71"/>
+        </w:numPr>
+        <w:jc w:val="both"/>
+        <w:rPr/>
+      </w:pPr>
+      <w:r>
+        <w:rPr>
+          <w:rFonts w:ascii="aptos" w:hAnsi="aptos"/>
+          <w:sz w:val="28"/>
+          <w:szCs w:val="28"/>
+        </w:rPr>
+        <w:t>But this is not a proper solution to store the data on localstorage.</w:t>
+      </w:r>
+    </w:p>
+    <w:p>
+      <w:pPr>
+        <w:pStyle w:val="TextBody"/>
+        <w:numPr>
+          <w:ilvl w:val="0"/>
+          <w:numId w:val="71"/>
+        </w:numPr>
+        <w:jc w:val="both"/>
+        <w:rPr/>
+      </w:pPr>
+      <w:r>
+        <w:rPr>
+          <w:rFonts w:ascii="aptos" w:hAnsi="aptos"/>
+          <w:sz w:val="28"/>
+          <w:szCs w:val="28"/>
+        </w:rPr>
+        <w:t xml:space="preserve">So we can use </w:t>
+      </w:r>
+      <w:r>
+        <w:rPr>
+          <w:rFonts w:ascii="aptos" w:hAnsi="aptos"/>
+          <w:sz w:val="28"/>
+          <w:szCs w:val="28"/>
+        </w:rPr>
+        <w:t>global component and set the filtered data in it so we can use it anywhere.</w:t>
+      </w:r>
+    </w:p>
+    <w:p>
+      <w:pPr>
+        <w:pStyle w:val="TextBody"/>
+        <w:numPr>
+          <w:ilvl w:val="0"/>
+          <w:numId w:val="71"/>
+        </w:numPr>
         <w:spacing w:before="0" w:after="140"/>
         <w:jc w:val="both"/>
-        <w:rPr>
-          <w:rFonts w:ascii="aptos" w:hAnsi="aptos"/>
-        </w:rPr>
-      </w:pPr>
-      <w:r>
-        <w:rPr>
-          <w:rFonts w:ascii="aptos" w:hAnsi="aptos"/>
-          <w:b w:val="false"/>
-          <w:bCs w:val="false"/>
-          <w:sz w:val="28"/>
-          <w:szCs w:val="26"/>
-        </w:rPr>
-        <w:t xml:space="preserve">1.  </w:t>
-      </w:r>
-      <w:r>
-        <w:rPr>
-          <w:rFonts w:ascii="aptos" w:hAnsi="aptos"/>
-          <w:b w:val="false"/>
-          <w:bCs w:val="false"/>
-          <w:sz w:val="28"/>
-          <w:szCs w:val="26"/>
-        </w:rPr>
-        <w:t>Multiple interceptor:</w:t>
-      </w:r>
-    </w:p>
-    <w:p>
-      <w:pPr>
-        <w:pStyle w:val="TextBody"/>
-        <w:numPr>
-          <w:ilvl w:val="0"/>
-          <w:numId w:val="65"/>
-        </w:numPr>
-        <w:spacing w:before="0" w:after="140"/>
-        <w:jc w:val="both"/>
-        <w:rPr>
-          <w:rFonts w:ascii="aptos" w:hAnsi="aptos"/>
-        </w:rPr>
-      </w:pPr>
-      <w:r>
-        <w:rPr>
-          <w:rFonts w:ascii="aptos" w:hAnsi="aptos"/>
-          <w:b w:val="false"/>
-          <w:bCs w:val="false"/>
-          <w:sz w:val="28"/>
-          <w:szCs w:val="26"/>
-        </w:rPr>
-        <w:t>we can add multiple interceptor for different action.</w:t>
-      </w:r>
-    </w:p>
-    <w:p>
-      <w:pPr>
-        <w:pStyle w:val="TextBody"/>
-        <w:numPr>
-          <w:ilvl w:val="0"/>
-          <w:numId w:val="65"/>
-        </w:numPr>
-        <w:spacing w:before="0" w:after="140"/>
-        <w:jc w:val="both"/>
-        <w:rPr>
-          <w:rFonts w:ascii="aptos" w:hAnsi="aptos"/>
-        </w:rPr>
-      </w:pPr>
-      <w:r>
-        <w:rPr>
-          <w:rFonts w:ascii="aptos" w:hAnsi="aptos"/>
-          <w:b w:val="false"/>
-          <w:bCs w:val="false"/>
-          <w:sz w:val="28"/>
-          <w:szCs w:val="26"/>
-        </w:rPr>
-        <w:t>Each interceptor will be executed</w:t>
-      </w:r>
-    </w:p>
-    <w:p>
-      <w:pPr>
-        <w:pStyle w:val="TextBody"/>
-        <w:numPr>
-          <w:ilvl w:val="0"/>
-          <w:numId w:val="65"/>
-        </w:numPr>
-        <w:spacing w:before="0" w:after="140"/>
-        <w:jc w:val="both"/>
-        <w:rPr>
-          <w:rFonts w:ascii="aptos" w:hAnsi="aptos"/>
-        </w:rPr>
-      </w:pPr>
-      <w:r>
-        <w:rPr>
-          <w:rFonts w:ascii="aptos" w:hAnsi="aptos"/>
-          <w:b w:val="false"/>
-          <w:bCs w:val="false"/>
-          <w:sz w:val="28"/>
-          <w:szCs w:val="26"/>
-        </w:rPr>
-        <w:t>request interceptor are executed in reverse order (LIFO).</w:t>
-      </w:r>
-      <w:r>
-        <w:rPr>
-          <w:rFonts w:ascii="aptos" w:hAnsi="aptos"/>
-          <w:b w:val="false"/>
-          <w:bCs w:val="false"/>
-          <w:sz w:val="28"/>
-          <w:szCs w:val="26"/>
-        </w:rPr>
-        <w:t>this is done so that default system configuration (by default config) can be overriden by more specific,</w:t>
-      </w:r>
-    </w:p>
-    <w:p>
-      <w:pPr>
-        <w:pStyle w:val="TextBody"/>
-        <w:numPr>
-          <w:ilvl w:val="0"/>
-          <w:numId w:val="65"/>
-        </w:numPr>
-        <w:spacing w:before="0" w:after="140"/>
-        <w:jc w:val="both"/>
-        <w:rPr>
-          <w:rFonts w:ascii="aptos" w:hAnsi="aptos"/>
-        </w:rPr>
-      </w:pPr>
-      <w:r>
-        <w:rPr>
-          <w:rFonts w:ascii="aptos" w:hAnsi="aptos"/>
-          <w:b w:val="false"/>
-          <w:bCs w:val="false"/>
-          <w:sz w:val="28"/>
-          <w:szCs w:val="26"/>
-        </w:rPr>
-        <w:t xml:space="preserve">response interceptor are executed in same order they were added (FIFO) </w:t>
-      </w:r>
-    </w:p>
-    <w:p>
-      <w:pPr>
-        <w:pStyle w:val="TextBody"/>
-        <w:numPr>
-          <w:ilvl w:val="0"/>
-          <w:numId w:val="65"/>
-        </w:numPr>
-        <w:spacing w:before="0" w:after="140"/>
-        <w:jc w:val="both"/>
-        <w:rPr>
-          <w:rFonts w:ascii="aptos" w:hAnsi="aptos"/>
-        </w:rPr>
-      </w:pPr>
-      <w:r>
-        <w:rPr>
-          <w:rFonts w:ascii="aptos" w:hAnsi="aptos"/>
-          <w:b w:val="false"/>
-          <w:bCs w:val="false"/>
-          <w:sz w:val="28"/>
-          <w:szCs w:val="26"/>
-        </w:rPr>
-        <w:t>interceptor pass the result to the next interceptor.</w:t>
-      </w:r>
-    </w:p>
-    <w:p>
-      <w:pPr>
-        <w:pStyle w:val="TextBody"/>
-        <w:numPr>
-          <w:ilvl w:val="0"/>
-          <w:numId w:val="65"/>
-        </w:numPr>
-        <w:spacing w:before="0" w:after="140"/>
-        <w:jc w:val="both"/>
-        <w:rPr>
-          <w:rFonts w:ascii="aptos" w:hAnsi="aptos"/>
-        </w:rPr>
-      </w:pPr>
-      <w:r>
-        <w:rPr>
-          <w:rFonts w:ascii="aptos" w:hAnsi="aptos"/>
-          <w:b w:val="false"/>
-          <w:bCs w:val="false"/>
-          <w:sz w:val="28"/>
-          <w:szCs w:val="26"/>
-        </w:rPr>
-        <w:t>Every interceptor gets the result of its previos interceptor.</w:t>
-      </w:r>
-    </w:p>
-    <w:p>
-      <w:pPr>
-        <w:pStyle w:val="TextBody"/>
-        <w:numPr>
-          <w:ilvl w:val="0"/>
-          <w:numId w:val="65"/>
-        </w:numPr>
-        <w:spacing w:before="0" w:after="140"/>
-        <w:jc w:val="both"/>
-        <w:rPr>
-          <w:rFonts w:ascii="aptos" w:hAnsi="aptos"/>
-        </w:rPr>
-      </w:pPr>
-      <w:r>
-        <w:rPr>
-          <w:rFonts w:ascii="aptos" w:hAnsi="aptos"/>
-          <w:b w:val="false"/>
-          <w:bCs w:val="false"/>
-          <w:sz w:val="28"/>
-          <w:szCs w:val="26"/>
-        </w:rPr>
-        <w:t>Only last interceptor is allowed to return result to the component.</w:t>
-      </w:r>
-    </w:p>
-    <w:p>
-      <w:pPr>
-        <w:pStyle w:val="TextBody"/>
-        <w:numPr>
-          <w:ilvl w:val="0"/>
-          <w:numId w:val="65"/>
-        </w:numPr>
-        <w:spacing w:before="0" w:after="140"/>
-        <w:jc w:val="both"/>
-        <w:rPr>
-          <w:rFonts w:ascii="aptos" w:hAnsi="aptos"/>
-        </w:rPr>
-      </w:pPr>
-      <w:r>
-        <w:rPr>
-          <w:rFonts w:ascii="aptos" w:hAnsi="aptos"/>
-          <w:b w:val="false"/>
-          <w:bCs w:val="false"/>
-          <w:sz w:val="28"/>
-          <w:szCs w:val="26"/>
-        </w:rPr>
-        <w:t>If 1</w:t>
-      </w:r>
-      <w:r>
-        <w:rPr>
-          <w:rFonts w:ascii="aptos" w:hAnsi="aptos"/>
-          <w:b w:val="false"/>
-          <w:bCs w:val="false"/>
-          <w:sz w:val="28"/>
-          <w:szCs w:val="26"/>
-          <w:vertAlign w:val="superscript"/>
-        </w:rPr>
-        <w:t>st</w:t>
-      </w:r>
-      <w:r>
-        <w:rPr>
-          <w:rFonts w:ascii="aptos" w:hAnsi="aptos"/>
-          <w:b w:val="false"/>
-          <w:bCs w:val="false"/>
-          <w:sz w:val="28"/>
-          <w:szCs w:val="26"/>
-        </w:rPr>
-        <w:t xml:space="preserve"> interceptor fails and occur an error then 2</w:t>
-      </w:r>
-      <w:r>
-        <w:rPr>
-          <w:rFonts w:ascii="aptos" w:hAnsi="aptos"/>
-          <w:b w:val="false"/>
-          <w:bCs w:val="false"/>
-          <w:sz w:val="28"/>
-          <w:szCs w:val="26"/>
-          <w:vertAlign w:val="superscript"/>
-        </w:rPr>
-        <w:t>nd</w:t>
-      </w:r>
-      <w:r>
-        <w:rPr>
-          <w:rFonts w:ascii="aptos" w:hAnsi="aptos"/>
-          <w:b w:val="false"/>
-          <w:bCs w:val="false"/>
-          <w:sz w:val="28"/>
-          <w:szCs w:val="26"/>
-        </w:rPr>
-        <w:t xml:space="preserve"> interceptor’s rejection part’s handler calls directly, it could not call response part of that interceptor.</w:t>
-      </w:r>
-    </w:p>
-    <w:p>
-      <w:pPr>
-        <w:pStyle w:val="TextBody"/>
-        <w:numPr>
-          <w:ilvl w:val="0"/>
-          <w:numId w:val="65"/>
-        </w:numPr>
-        <w:spacing w:before="0" w:after="140"/>
-        <w:jc w:val="both"/>
-        <w:rPr>
-          <w:rFonts w:ascii="aptos" w:hAnsi="aptos"/>
-        </w:rPr>
-      </w:pPr>
-      <w:r>
-        <w:rPr>
-          <w:rFonts w:ascii="aptos" w:hAnsi="aptos"/>
-          <w:b w:val="false"/>
-          <w:bCs w:val="false"/>
-          <w:sz w:val="28"/>
-          <w:szCs w:val="26"/>
-        </w:rPr>
-        <w:t>If interceptor 2 dont reso</w:t>
-      </w:r>
-      <w:r>
-        <w:rPr>
-          <w:rFonts w:ascii="aptos" w:hAnsi="aptos"/>
-          <w:b w:val="false"/>
-          <w:bCs w:val="false"/>
-          <w:sz w:val="28"/>
-          <w:szCs w:val="26"/>
-        </w:rPr>
-        <w:t>l</w:t>
-      </w:r>
-      <w:r>
-        <w:rPr>
-          <w:rFonts w:ascii="aptos" w:hAnsi="aptos"/>
-          <w:b w:val="false"/>
-          <w:bCs w:val="false"/>
-          <w:sz w:val="28"/>
-          <w:szCs w:val="26"/>
-        </w:rPr>
-        <w:t>ve the error then if interceptor 2 is the last iinterceptor then the error caught by the catch statement then show on the ui.</w:t>
-      </w:r>
-    </w:p>
-    <w:p>
-      <w:pPr>
-        <w:pStyle w:val="TextBody"/>
-        <w:numPr>
-          <w:ilvl w:val="0"/>
-          <w:numId w:val="65"/>
-        </w:numPr>
-        <w:spacing w:before="0" w:after="140"/>
-        <w:jc w:val="both"/>
-        <w:rPr>
-          <w:rFonts w:ascii="aptos" w:hAnsi="aptos"/>
-        </w:rPr>
-      </w:pPr>
-      <w:r>
-        <w:rPr>
-          <w:rFonts w:ascii="aptos" w:hAnsi="aptos"/>
-          <w:b w:val="false"/>
-          <w:bCs w:val="false"/>
-          <w:sz w:val="28"/>
-          <w:szCs w:val="26"/>
-        </w:rPr>
-        <w:t xml:space="preserve">If interceptor 2 </w:t>
-      </w:r>
-      <w:r>
-        <w:rPr>
-          <w:rFonts w:ascii="aptos" w:hAnsi="aptos"/>
-          <w:b w:val="false"/>
-          <w:bCs w:val="false"/>
-          <w:sz w:val="28"/>
-          <w:szCs w:val="26"/>
-        </w:rPr>
-        <w:t>can resolve the error, it resolve and if there is another interceptor 3 then it moves to the interceptor 3 success part otherwise the result returned and pass to the component.</w:t>
-      </w:r>
-    </w:p>
-    <w:p>
-      <w:pPr>
-        <w:pStyle w:val="TextBody"/>
-        <w:spacing w:before="0" w:after="140"/>
-        <w:jc w:val="both"/>
-        <w:rPr>
-          <w:b w:val="false"/>
-          <w:b w:val="false"/>
-          <w:bCs w:val="false"/>
-          <w:sz w:val="28"/>
-          <w:szCs w:val="26"/>
-        </w:rPr>
-      </w:pPr>
-      <w:r>
-        <w:rPr>
-          <w:rFonts w:ascii="aptos" w:hAnsi="aptos"/>
-        </w:rPr>
-      </w:r>
-    </w:p>
-    <w:p>
-      <w:pPr>
-        <w:pStyle w:val="TextBody"/>
-        <w:spacing w:before="0" w:after="140"/>
-        <w:jc w:val="both"/>
-        <w:rPr>
-          <w:rFonts w:ascii="aptos" w:hAnsi="aptos"/>
-        </w:rPr>
-      </w:pPr>
-      <w:r>
-        <w:rPr>
-          <w:rFonts w:ascii="aptos" w:hAnsi="aptos"/>
-          <w:b w:val="false"/>
-          <w:bCs w:val="false"/>
-          <w:sz w:val="28"/>
-          <w:szCs w:val="26"/>
-        </w:rPr>
-        <w:t xml:space="preserve">4. </w:t>
-      </w:r>
-      <w:r>
-        <w:rPr>
-          <w:rFonts w:ascii="aptos" w:hAnsi="aptos"/>
-          <w:b w:val="false"/>
-          <w:bCs w:val="false"/>
-          <w:sz w:val="28"/>
-          <w:szCs w:val="26"/>
-        </w:rPr>
-        <w:t>How to fix the size of textarea field without drag option?</w:t>
-      </w:r>
-    </w:p>
-    <w:p>
-      <w:pPr>
-        <w:pStyle w:val="TextBody"/>
-        <w:spacing w:before="0" w:after="140"/>
-        <w:jc w:val="both"/>
-        <w:rPr>
-          <w:rFonts w:ascii="aptos" w:hAnsi="aptos"/>
-        </w:rPr>
-      </w:pPr>
-      <w:r>
-        <w:rPr>
-          <w:rFonts w:ascii="aptos" w:hAnsi="aptos"/>
-          <w:b w:val="false"/>
-          <w:bCs w:val="false"/>
-          <w:sz w:val="28"/>
-          <w:szCs w:val="26"/>
-        </w:rPr>
-        <w:t>Ans: Give height and widht / row and column property for size.</w:t>
-      </w:r>
-    </w:p>
-    <w:p>
-      <w:pPr>
-        <w:pStyle w:val="TextBody"/>
-        <w:numPr>
-          <w:ilvl w:val="0"/>
-          <w:numId w:val="66"/>
-        </w:numPr>
-        <w:spacing w:before="0" w:after="140"/>
-        <w:jc w:val="both"/>
-        <w:rPr>
-          <w:rFonts w:ascii="aptos" w:hAnsi="aptos"/>
-        </w:rPr>
-      </w:pPr>
-      <w:r>
-        <w:rPr>
-          <w:rFonts w:ascii="aptos" w:hAnsi="aptos"/>
-          <w:b w:val="false"/>
-          <w:bCs w:val="false"/>
-          <w:sz w:val="28"/>
-          <w:szCs w:val="26"/>
-        </w:rPr>
-        <w:t>Then give resize – none :- it fix the size we given and do not show the drag text area box.</w:t>
-      </w:r>
-    </w:p>
-    <w:p>
-      <w:pPr>
-        <w:pStyle w:val="TextBody"/>
-        <w:numPr>
-          <w:ilvl w:val="0"/>
-          <w:numId w:val="66"/>
-        </w:numPr>
-        <w:spacing w:before="0" w:after="140"/>
-        <w:jc w:val="both"/>
-        <w:rPr>
-          <w:rFonts w:ascii="aptos" w:hAnsi="aptos"/>
-          <w:sz w:val="28"/>
-          <w:szCs w:val="28"/>
-        </w:rPr>
-      </w:pPr>
-      <w:r>
-        <w:rPr>
-          <w:rFonts w:ascii="aptos" w:hAnsi="aptos"/>
-          <w:sz w:val="28"/>
-          <w:szCs w:val="28"/>
-        </w:rPr>
-        <w:t>&lt;textarea placeholder="Write here.." className=" w-full h-20 resize-none "/&gt;</w:t>
-      </w:r>
-    </w:p>
-    <w:p>
-      <w:pPr>
-        <w:pStyle w:val="TextBody"/>
-        <w:spacing w:before="0" w:after="140"/>
-        <w:jc w:val="both"/>
-        <w:rPr>
-          <w:rFonts w:ascii="aptos" w:hAnsi="aptos"/>
-          <w:sz w:val="28"/>
-          <w:szCs w:val="28"/>
-        </w:rPr>
-      </w:pPr>
-      <w:r>
-        <w:rPr>
-          <w:rFonts w:ascii="aptos" w:hAnsi="aptos"/>
-          <w:sz w:val="28"/>
-          <w:szCs w:val="28"/>
-        </w:rPr>
-      </w:r>
-    </w:p>
-    <w:p>
-      <w:pPr>
-        <w:pStyle w:val="TextBody"/>
-        <w:spacing w:before="0" w:after="140"/>
-        <w:jc w:val="both"/>
-        <w:rPr>
-          <w:rFonts w:ascii="aptos" w:hAnsi="aptos"/>
-          <w:sz w:val="28"/>
-          <w:szCs w:val="28"/>
-        </w:rPr>
-      </w:pPr>
-      <w:r>
-        <w:rPr>
-          <w:rFonts w:ascii="aptos" w:hAnsi="aptos"/>
-          <w:sz w:val="28"/>
-          <w:szCs w:val="28"/>
-        </w:rPr>
-      </w:r>
-    </w:p>
-    <w:p>
-      <w:pPr>
-        <w:pStyle w:val="TextBody"/>
-        <w:spacing w:before="0" w:after="140"/>
-        <w:jc w:val="both"/>
-        <w:rPr>
-          <w:rFonts w:ascii="aptos" w:hAnsi="aptos"/>
-          <w:sz w:val="28"/>
-          <w:szCs w:val="28"/>
-        </w:rPr>
-      </w:pPr>
-      <w:r>
-        <w:rPr>
-          <w:rFonts w:ascii="aptos" w:hAnsi="aptos"/>
-          <w:sz w:val="28"/>
-          <w:szCs w:val="28"/>
-        </w:rPr>
-        <w:t>5. If server send the error then how can we show the custom error on the ui?</w:t>
-      </w:r>
-    </w:p>
-    <w:p>
-      <w:pPr>
-        <w:pStyle w:val="TextBody"/>
-        <w:spacing w:before="0" w:after="140"/>
-        <w:jc w:val="both"/>
-        <w:rPr>
-          <w:rFonts w:ascii="aptos" w:hAnsi="aptos"/>
-          <w:sz w:val="28"/>
-          <w:szCs w:val="28"/>
-          <w:u w:val="none"/>
-        </w:rPr>
-      </w:pPr>
-      <w:r>
-        <w:rPr>
-          <w:rFonts w:ascii="aptos" w:hAnsi="aptos"/>
-          <w:sz w:val="28"/>
-          <w:szCs w:val="28"/>
-          <w:u w:val="none"/>
-        </w:rPr>
-        <w:t>6. If url query params have extra space.</w:t>
-      </w:r>
-    </w:p>
-    <w:p>
-      <w:pPr>
-        <w:pStyle w:val="TextBody"/>
-        <w:spacing w:before="0" w:after="140"/>
-        <w:jc w:val="both"/>
         <w:rPr/>
       </w:pPr>
       <w:r>
@@ -20892,277 +21803,16 @@
           <w:rFonts w:ascii="aptos" w:hAnsi="aptos"/>
           <w:sz w:val="28"/>
           <w:szCs w:val="28"/>
-          <w:u w:val="none"/>
-        </w:rPr>
-        <w:t xml:space="preserve">Ans: If we add a extra space, then </w:t>
-      </w:r>
-      <w:r>
-        <w:rPr>
-          <w:rFonts w:ascii="aptos" w:hAnsi="aptos"/>
-          <w:sz w:val="28"/>
-          <w:szCs w:val="28"/>
-          <w:u w:val="none"/>
-        </w:rPr>
-        <w:t xml:space="preserve">pace character in a URL query string is encoded as </w:t>
-      </w:r>
-      <w:r>
-        <w:rPr>
-          <w:rStyle w:val="SourceText"/>
-          <w:rFonts w:ascii="aptos" w:hAnsi="aptos"/>
-          <w:b w:val="false"/>
-          <w:strike w:val="false"/>
-          <w:dstrike w:val="false"/>
-          <w:sz w:val="28"/>
-          <w:szCs w:val="28"/>
-          <w:u w:val="none"/>
-          <w:effect w:val="none"/>
-          <w:bdr w:val="single" w:sz="6" w:space="1" w:color="F0F2F5"/>
-        </w:rPr>
-        <w:t xml:space="preserve">%20 </w:t>
-      </w:r>
-      <w:r>
-        <w:rPr>
-          <w:rStyle w:val="SourceText"/>
-          <w:rFonts w:ascii="aptos" w:hAnsi="aptos"/>
-          <w:b w:val="false"/>
-          <w:strike w:val="false"/>
-          <w:dstrike w:val="false"/>
-          <w:sz w:val="28"/>
-          <w:szCs w:val="28"/>
-          <w:u w:val="none"/>
-          <w:effect w:val="none"/>
-          <w:bdr w:val="single" w:sz="6" w:space="1" w:color="F0F2F5"/>
-        </w:rPr>
-        <w:t>or +.</w:t>
-      </w:r>
-    </w:p>
-    <w:p>
-      <w:pPr>
-        <w:pStyle w:val="TextBody"/>
-        <w:numPr>
-          <w:ilvl w:val="0"/>
-          <w:numId w:val="67"/>
-        </w:numPr>
-        <w:spacing w:before="0" w:after="140"/>
-        <w:jc w:val="both"/>
-        <w:rPr/>
-      </w:pPr>
-      <w:r>
-        <w:rPr>
-          <w:rStyle w:val="SourceText"/>
-          <w:rFonts w:ascii="aptos" w:hAnsi="aptos"/>
-          <w:b w:val="false"/>
-          <w:strike w:val="false"/>
-          <w:dstrike w:val="false"/>
-          <w:sz w:val="28"/>
-          <w:szCs w:val="28"/>
-          <w:u w:val="none"/>
-          <w:effect w:val="none"/>
-          <w:bdr w:val="single" w:sz="6" w:space="1" w:color="F0F2F5"/>
-        </w:rPr>
-        <w:t>The page loads mormally and the space does not crash the browser.</w:t>
-      </w:r>
-    </w:p>
-    <w:p>
-      <w:pPr>
-        <w:pStyle w:val="TextBody"/>
-        <w:numPr>
-          <w:ilvl w:val="0"/>
-          <w:numId w:val="67"/>
-        </w:numPr>
-        <w:spacing w:before="0" w:after="140"/>
-        <w:jc w:val="both"/>
-        <w:rPr/>
-      </w:pPr>
-      <w:r>
-        <w:rPr>
-          <w:rStyle w:val="SourceText"/>
-          <w:rFonts w:ascii="aptos" w:hAnsi="aptos"/>
-          <w:b w:val="false"/>
-          <w:strike w:val="false"/>
-          <w:dstrike w:val="false"/>
-          <w:sz w:val="28"/>
-          <w:szCs w:val="28"/>
-          <w:u w:val="none"/>
-          <w:effect w:val="none"/>
-          <w:bdr w:val="single" w:sz="6" w:space="1" w:color="F0F2F5"/>
-        </w:rPr>
-        <w:t>When the url paste on the browser then the browser automatically add %20 or + instead of space.</w:t>
-      </w:r>
-    </w:p>
-    <w:p>
-      <w:pPr>
-        <w:pStyle w:val="TextBody"/>
-        <w:numPr>
-          <w:ilvl w:val="0"/>
-          <w:numId w:val="67"/>
-        </w:numPr>
-        <w:spacing w:before="0" w:after="140"/>
-        <w:jc w:val="both"/>
-        <w:rPr/>
-      </w:pPr>
-      <w:r>
-        <w:rPr>
-          <w:rStyle w:val="SourceText"/>
-          <w:rFonts w:ascii="aptos" w:hAnsi="aptos"/>
-          <w:b w:val="false"/>
-          <w:strike w:val="false"/>
-          <w:dstrike w:val="false"/>
-          <w:sz w:val="28"/>
-          <w:szCs w:val="28"/>
-          <w:u w:val="none"/>
-          <w:effect w:val="none"/>
-          <w:bdr w:val="single" w:sz="6" w:space="1" w:color="F0F2F5"/>
-        </w:rPr>
-        <w:t>server catch the url and looks at the endpoint /task and understand that load the task page route.</w:t>
-      </w:r>
-    </w:p>
-    <w:p>
-      <w:pPr>
-        <w:pStyle w:val="TextBody"/>
-        <w:numPr>
-          <w:ilvl w:val="0"/>
-          <w:numId w:val="67"/>
-        </w:numPr>
-        <w:spacing w:before="0" w:after="140"/>
-        <w:jc w:val="both"/>
-        <w:rPr/>
-      </w:pPr>
-      <w:r>
-        <w:rPr>
-          <w:rStyle w:val="SourceText"/>
-          <w:rFonts w:ascii="aptos" w:hAnsi="aptos"/>
-          <w:b w:val="false"/>
-          <w:strike w:val="false"/>
-          <w:dstrike w:val="false"/>
-          <w:sz w:val="28"/>
-          <w:szCs w:val="28"/>
-          <w:u w:val="none"/>
-          <w:effect w:val="none"/>
-          <w:bdr w:val="single" w:sz="6" w:space="1" w:color="F0F2F5"/>
-        </w:rPr>
-        <w:t>Then server looks at the query parameters of the url and splits them using the &amp; symbol.</w:t>
-      </w:r>
-    </w:p>
-    <w:p>
-      <w:pPr>
-        <w:pStyle w:val="TextBody"/>
-        <w:numPr>
-          <w:ilvl w:val="0"/>
-          <w:numId w:val="67"/>
-        </w:numPr>
-        <w:spacing w:before="0" w:after="140"/>
-        <w:jc w:val="both"/>
-        <w:rPr/>
-      </w:pPr>
-      <w:r>
-        <w:rPr>
-          <w:rStyle w:val="SourceText"/>
-          <w:rFonts w:ascii="aptos" w:hAnsi="aptos"/>
-          <w:b w:val="false"/>
-          <w:strike w:val="false"/>
-          <w:dstrike w:val="false"/>
-          <w:sz w:val="28"/>
-          <w:szCs w:val="28"/>
-          <w:u w:val="none"/>
-          <w:effect w:val="none"/>
-          <w:bdr w:val="single" w:sz="6" w:space="1" w:color="F0F2F5"/>
-        </w:rPr>
-        <w:t>Then it convert “%20” to space. Afer this, the key become “ search”.</w:t>
-      </w:r>
-    </w:p>
-    <w:p>
-      <w:pPr>
-        <w:pStyle w:val="TextBody"/>
-        <w:numPr>
-          <w:ilvl w:val="0"/>
-          <w:numId w:val="67"/>
-        </w:numPr>
-        <w:spacing w:before="0" w:after="140"/>
-        <w:jc w:val="both"/>
-        <w:rPr/>
-      </w:pPr>
-      <w:r>
-        <w:rPr>
-          <w:rStyle w:val="SourceText"/>
-          <w:rFonts w:ascii="aptos" w:hAnsi="aptos"/>
-          <w:b w:val="false"/>
-          <w:strike w:val="false"/>
-          <w:dstrike w:val="false"/>
-          <w:sz w:val="28"/>
-          <w:szCs w:val="28"/>
-          <w:u w:val="none"/>
-          <w:effect w:val="none"/>
-          <w:bdr w:val="single" w:sz="6" w:space="1" w:color="F0F2F5"/>
-        </w:rPr>
-        <w:t>Then because of the space the search filters in ignored and if backend have strict validation then it give the 400 – Bad request.</w:t>
-      </w:r>
-    </w:p>
-    <w:p>
-      <w:pPr>
-        <w:pStyle w:val="TextBody"/>
-        <w:spacing w:before="0" w:after="140"/>
-        <w:jc w:val="both"/>
-        <w:rPr>
-          <w:rStyle w:val="SourceText"/>
-          <w:rFonts w:ascii="aptos" w:hAnsi="aptos"/>
-          <w:b w:val="false"/>
-          <w:strike w:val="false"/>
-          <w:dstrike w:val="false"/>
-          <w:sz w:val="28"/>
-          <w:szCs w:val="28"/>
-          <w:u w:val="none"/>
-          <w:effect w:val="none"/>
-          <w:bdr w:val="single" w:sz="6" w:space="1" w:color="F0F2F5"/>
-        </w:rPr>
-      </w:pPr>
-      <w:r>
-        <w:rPr/>
-      </w:r>
-    </w:p>
-    <w:p>
-      <w:pPr>
-        <w:pStyle w:val="TextBody"/>
-        <w:spacing w:before="0" w:after="140"/>
-        <w:jc w:val="both"/>
-        <w:rPr>
-          <w:rStyle w:val="SourceText"/>
-          <w:rFonts w:ascii="aptos" w:hAnsi="aptos"/>
-          <w:b w:val="false"/>
-          <w:strike w:val="false"/>
-          <w:dstrike w:val="false"/>
-          <w:sz w:val="28"/>
-          <w:szCs w:val="28"/>
-          <w:u w:val="none"/>
-          <w:effect w:val="none"/>
-          <w:bdr w:val="single" w:sz="6" w:space="1" w:color="F0F2F5"/>
-        </w:rPr>
-      </w:pPr>
-      <w:r>
-        <w:rPr/>
-      </w:r>
-    </w:p>
-    <w:p>
-      <w:pPr>
-        <w:pStyle w:val="TextBody"/>
-        <w:spacing w:before="0" w:after="140"/>
-        <w:jc w:val="both"/>
-        <w:rPr/>
-      </w:pPr>
-      <w:r>
-        <w:rPr>
-          <w:rStyle w:val="SourceText"/>
-          <w:rFonts w:ascii="aptos" w:hAnsi="aptos"/>
-          <w:b w:val="false"/>
-          <w:strike w:val="false"/>
-          <w:dstrike w:val="false"/>
-          <w:sz w:val="28"/>
-          <w:szCs w:val="28"/>
-          <w:u w:val="none"/>
-          <w:effect w:val="none"/>
-          <w:bdr w:val="single" w:sz="6" w:space="1" w:color="F0F2F5"/>
-        </w:rPr>
-        <w:tab/>
+        </w:rPr>
+        <w:t>W</w:t>
+      </w:r>
+      <w:r>
+        <w:rPr>
+          <w:rFonts w:ascii="aptos" w:hAnsi="aptos"/>
+          <w:sz w:val="28"/>
+          <w:szCs w:val="28"/>
+        </w:rPr>
+        <w:t>e can also use zustand and tanstack query to store the data in queryKey and queryFn.</w:t>
       </w:r>
     </w:p>
     <w:sectPr>
@@ -30257,6 +30907,599 @@
     </w:lvl>
   </w:abstractNum>
   <w:abstractNum w:abstractNumId="68">
+    <w:lvl w:ilvl="0">
+      <w:start w:val="1"/>
+      <w:numFmt w:val="none"/>
+      <w:suff w:val="nothing"/>
+      <w:lvlText w:val=""/>
+      <w:lvlJc w:val="left"/>
+      <w:pPr>
+        <w:tabs>
+          <w:tab w:val="num" w:pos="0"/>
+        </w:tabs>
+        <w:ind w:left="0" w:hanging="0"/>
+      </w:pPr>
+      <w:rPr/>
+    </w:lvl>
+    <w:lvl w:ilvl="1">
+      <w:start w:val="1"/>
+      <w:numFmt w:val="none"/>
+      <w:suff w:val="nothing"/>
+      <w:lvlText w:val=""/>
+      <w:lvlJc w:val="left"/>
+      <w:pPr>
+        <w:tabs>
+          <w:tab w:val="num" w:pos="0"/>
+        </w:tabs>
+        <w:ind w:left="0" w:hanging="0"/>
+      </w:pPr>
+      <w:rPr/>
+    </w:lvl>
+    <w:lvl w:ilvl="2">
+      <w:start w:val="1"/>
+      <w:numFmt w:val="none"/>
+      <w:suff w:val="nothing"/>
+      <w:lvlText w:val=""/>
+      <w:lvlJc w:val="left"/>
+      <w:pPr>
+        <w:tabs>
+          <w:tab w:val="num" w:pos="0"/>
+        </w:tabs>
+        <w:ind w:left="0" w:hanging="0"/>
+      </w:pPr>
+      <w:rPr/>
+    </w:lvl>
+    <w:lvl w:ilvl="3">
+      <w:start w:val="1"/>
+      <w:numFmt w:val="none"/>
+      <w:suff w:val="nothing"/>
+      <w:lvlText w:val=""/>
+      <w:lvlJc w:val="left"/>
+      <w:pPr>
+        <w:tabs>
+          <w:tab w:val="num" w:pos="0"/>
+        </w:tabs>
+        <w:ind w:left="0" w:hanging="0"/>
+      </w:pPr>
+      <w:rPr/>
+    </w:lvl>
+    <w:lvl w:ilvl="4">
+      <w:start w:val="1"/>
+      <w:numFmt w:val="none"/>
+      <w:suff w:val="nothing"/>
+      <w:lvlText w:val=""/>
+      <w:lvlJc w:val="left"/>
+      <w:pPr>
+        <w:tabs>
+          <w:tab w:val="num" w:pos="0"/>
+        </w:tabs>
+        <w:ind w:left="0" w:hanging="0"/>
+      </w:pPr>
+      <w:rPr/>
+    </w:lvl>
+    <w:lvl w:ilvl="5">
+      <w:start w:val="1"/>
+      <w:numFmt w:val="none"/>
+      <w:suff w:val="nothing"/>
+      <w:lvlText w:val=""/>
+      <w:lvlJc w:val="left"/>
+      <w:pPr>
+        <w:tabs>
+          <w:tab w:val="num" w:pos="0"/>
+        </w:tabs>
+        <w:ind w:left="0" w:hanging="0"/>
+      </w:pPr>
+      <w:rPr/>
+    </w:lvl>
+    <w:lvl w:ilvl="6">
+      <w:start w:val="1"/>
+      <w:numFmt w:val="none"/>
+      <w:suff w:val="nothing"/>
+      <w:lvlText w:val=""/>
+      <w:lvlJc w:val="left"/>
+      <w:pPr>
+        <w:tabs>
+          <w:tab w:val="num" w:pos="0"/>
+        </w:tabs>
+        <w:ind w:left="0" w:hanging="0"/>
+      </w:pPr>
+      <w:rPr/>
+    </w:lvl>
+    <w:lvl w:ilvl="7">
+      <w:start w:val="1"/>
+      <w:numFmt w:val="none"/>
+      <w:suff w:val="nothing"/>
+      <w:lvlText w:val=""/>
+      <w:lvlJc w:val="left"/>
+      <w:pPr>
+        <w:tabs>
+          <w:tab w:val="num" w:pos="0"/>
+        </w:tabs>
+        <w:ind w:left="0" w:hanging="0"/>
+      </w:pPr>
+      <w:rPr/>
+    </w:lvl>
+    <w:lvl w:ilvl="8">
+      <w:start w:val="1"/>
+      <w:numFmt w:val="none"/>
+      <w:suff w:val="nothing"/>
+      <w:lvlText w:val=""/>
+      <w:lvlJc w:val="left"/>
+      <w:pPr>
+        <w:tabs>
+          <w:tab w:val="num" w:pos="0"/>
+        </w:tabs>
+        <w:ind w:left="0" w:hanging="0"/>
+      </w:pPr>
+      <w:rPr/>
+    </w:lvl>
+  </w:abstractNum>
+  <w:abstractNum w:abstractNumId="69">
+    <w:lvl w:ilvl="0">
+      <w:start w:val="1"/>
+      <w:numFmt w:val="bullet"/>
+      <w:lvlText w:val=""/>
+      <w:lvlJc w:val="left"/>
+      <w:pPr>
+        <w:tabs>
+          <w:tab w:val="num" w:pos="720"/>
+        </w:tabs>
+        <w:ind w:left="720" w:hanging="360"/>
+      </w:pPr>
+      <w:rPr>
+        <w:rFonts w:ascii="Symbol" w:hAnsi="Symbol" w:cs="Symbol" w:hint="default"/>
+        <w:sz w:val="24"/>
+        <w:szCs w:val="24"/>
+      </w:rPr>
+    </w:lvl>
+    <w:lvl w:ilvl="1">
+      <w:start w:val="1"/>
+      <w:numFmt w:val="bullet"/>
+      <w:lvlText w:val="◦"/>
+      <w:lvlJc w:val="left"/>
+      <w:pPr>
+        <w:tabs>
+          <w:tab w:val="num" w:pos="1080"/>
+        </w:tabs>
+        <w:ind w:left="1080" w:hanging="360"/>
+      </w:pPr>
+      <w:rPr>
+        <w:rFonts w:ascii="OpenSymbol" w:hAnsi="OpenSymbol" w:cs="OpenSymbol" w:hint="default"/>
+        <w:sz w:val="24"/>
+        <w:szCs w:val="24"/>
+      </w:rPr>
+    </w:lvl>
+    <w:lvl w:ilvl="2">
+      <w:start w:val="1"/>
+      <w:numFmt w:val="bullet"/>
+      <w:lvlText w:val="▪"/>
+      <w:lvlJc w:val="left"/>
+      <w:pPr>
+        <w:tabs>
+          <w:tab w:val="num" w:pos="1440"/>
+        </w:tabs>
+        <w:ind w:left="1440" w:hanging="360"/>
+      </w:pPr>
+      <w:rPr>
+        <w:rFonts w:ascii="OpenSymbol" w:hAnsi="OpenSymbol" w:cs="OpenSymbol" w:hint="default"/>
+        <w:sz w:val="24"/>
+        <w:szCs w:val="24"/>
+      </w:rPr>
+    </w:lvl>
+    <w:lvl w:ilvl="3">
+      <w:start w:val="1"/>
+      <w:numFmt w:val="bullet"/>
+      <w:lvlText w:val=""/>
+      <w:lvlJc w:val="left"/>
+      <w:pPr>
+        <w:tabs>
+          <w:tab w:val="num" w:pos="1800"/>
+        </w:tabs>
+        <w:ind w:left="1800" w:hanging="360"/>
+      </w:pPr>
+      <w:rPr>
+        <w:rFonts w:ascii="Symbol" w:hAnsi="Symbol" w:cs="Symbol" w:hint="default"/>
+        <w:sz w:val="24"/>
+        <w:szCs w:val="24"/>
+      </w:rPr>
+    </w:lvl>
+    <w:lvl w:ilvl="4">
+      <w:start w:val="1"/>
+      <w:numFmt w:val="bullet"/>
+      <w:lvlText w:val="◦"/>
+      <w:lvlJc w:val="left"/>
+      <w:pPr>
+        <w:tabs>
+          <w:tab w:val="num" w:pos="2160"/>
+        </w:tabs>
+        <w:ind w:left="2160" w:hanging="360"/>
+      </w:pPr>
+      <w:rPr>
+        <w:rFonts w:ascii="OpenSymbol" w:hAnsi="OpenSymbol" w:cs="OpenSymbol" w:hint="default"/>
+        <w:sz w:val="24"/>
+        <w:szCs w:val="24"/>
+      </w:rPr>
+    </w:lvl>
+    <w:lvl w:ilvl="5">
+      <w:start w:val="1"/>
+      <w:numFmt w:val="bullet"/>
+      <w:lvlText w:val="▪"/>
+      <w:lvlJc w:val="left"/>
+      <w:pPr>
+        <w:tabs>
+          <w:tab w:val="num" w:pos="2520"/>
+        </w:tabs>
+        <w:ind w:left="2520" w:hanging="360"/>
+      </w:pPr>
+      <w:rPr>
+        <w:rFonts w:ascii="OpenSymbol" w:hAnsi="OpenSymbol" w:cs="OpenSymbol" w:hint="default"/>
+        <w:sz w:val="24"/>
+        <w:szCs w:val="24"/>
+      </w:rPr>
+    </w:lvl>
+    <w:lvl w:ilvl="6">
+      <w:start w:val="1"/>
+      <w:numFmt w:val="bullet"/>
+      <w:lvlText w:val=""/>
+      <w:lvlJc w:val="left"/>
+      <w:pPr>
+        <w:tabs>
+          <w:tab w:val="num" w:pos="2880"/>
+        </w:tabs>
+        <w:ind w:left="2880" w:hanging="360"/>
+      </w:pPr>
+      <w:rPr>
+        <w:rFonts w:ascii="Symbol" w:hAnsi="Symbol" w:cs="Symbol" w:hint="default"/>
+        <w:sz w:val="24"/>
+        <w:szCs w:val="24"/>
+      </w:rPr>
+    </w:lvl>
+    <w:lvl w:ilvl="7">
+      <w:start w:val="1"/>
+      <w:numFmt w:val="bullet"/>
+      <w:lvlText w:val="◦"/>
+      <w:lvlJc w:val="left"/>
+      <w:pPr>
+        <w:tabs>
+          <w:tab w:val="num" w:pos="3240"/>
+        </w:tabs>
+        <w:ind w:left="3240" w:hanging="360"/>
+      </w:pPr>
+      <w:rPr>
+        <w:rFonts w:ascii="OpenSymbol" w:hAnsi="OpenSymbol" w:cs="OpenSymbol" w:hint="default"/>
+        <w:sz w:val="24"/>
+        <w:szCs w:val="24"/>
+      </w:rPr>
+    </w:lvl>
+    <w:lvl w:ilvl="8">
+      <w:start w:val="1"/>
+      <w:numFmt w:val="bullet"/>
+      <w:lvlText w:val="▪"/>
+      <w:lvlJc w:val="left"/>
+      <w:pPr>
+        <w:tabs>
+          <w:tab w:val="num" w:pos="3600"/>
+        </w:tabs>
+        <w:ind w:left="3600" w:hanging="360"/>
+      </w:pPr>
+      <w:rPr>
+        <w:rFonts w:ascii="OpenSymbol" w:hAnsi="OpenSymbol" w:cs="OpenSymbol" w:hint="default"/>
+        <w:sz w:val="24"/>
+        <w:szCs w:val="24"/>
+      </w:rPr>
+    </w:lvl>
+  </w:abstractNum>
+  <w:abstractNum w:abstractNumId="70">
+    <w:lvl w:ilvl="0">
+      <w:start w:val="1"/>
+      <w:numFmt w:val="bullet"/>
+      <w:lvlText w:val=""/>
+      <w:lvlJc w:val="left"/>
+      <w:pPr>
+        <w:tabs>
+          <w:tab w:val="num" w:pos="720"/>
+        </w:tabs>
+        <w:ind w:left="720" w:hanging="360"/>
+      </w:pPr>
+      <w:rPr>
+        <w:rFonts w:ascii="Symbol" w:hAnsi="Symbol" w:cs="Symbol" w:hint="default"/>
+        <w:sz w:val="24"/>
+        <w:szCs w:val="24"/>
+      </w:rPr>
+    </w:lvl>
+    <w:lvl w:ilvl="1">
+      <w:start w:val="1"/>
+      <w:numFmt w:val="bullet"/>
+      <w:lvlText w:val="◦"/>
+      <w:lvlJc w:val="left"/>
+      <w:pPr>
+        <w:tabs>
+          <w:tab w:val="num" w:pos="1080"/>
+        </w:tabs>
+        <w:ind w:left="1080" w:hanging="360"/>
+      </w:pPr>
+      <w:rPr>
+        <w:rFonts w:ascii="OpenSymbol" w:hAnsi="OpenSymbol" w:cs="OpenSymbol" w:hint="default"/>
+        <w:sz w:val="24"/>
+        <w:szCs w:val="24"/>
+      </w:rPr>
+    </w:lvl>
+    <w:lvl w:ilvl="2">
+      <w:start w:val="1"/>
+      <w:numFmt w:val="bullet"/>
+      <w:lvlText w:val="▪"/>
+      <w:lvlJc w:val="left"/>
+      <w:pPr>
+        <w:tabs>
+          <w:tab w:val="num" w:pos="1440"/>
+        </w:tabs>
+        <w:ind w:left="1440" w:hanging="360"/>
+      </w:pPr>
+      <w:rPr>
+        <w:rFonts w:ascii="OpenSymbol" w:hAnsi="OpenSymbol" w:cs="OpenSymbol" w:hint="default"/>
+        <w:sz w:val="24"/>
+        <w:szCs w:val="24"/>
+      </w:rPr>
+    </w:lvl>
+    <w:lvl w:ilvl="3">
+      <w:start w:val="1"/>
+      <w:numFmt w:val="bullet"/>
+      <w:lvlText w:val=""/>
+      <w:lvlJc w:val="left"/>
+      <w:pPr>
+        <w:tabs>
+          <w:tab w:val="num" w:pos="1800"/>
+        </w:tabs>
+        <w:ind w:left="1800" w:hanging="360"/>
+      </w:pPr>
+      <w:rPr>
+        <w:rFonts w:ascii="Symbol" w:hAnsi="Symbol" w:cs="Symbol" w:hint="default"/>
+        <w:sz w:val="24"/>
+        <w:szCs w:val="24"/>
+      </w:rPr>
+    </w:lvl>
+    <w:lvl w:ilvl="4">
+      <w:start w:val="1"/>
+      <w:numFmt w:val="bullet"/>
+      <w:lvlText w:val="◦"/>
+      <w:lvlJc w:val="left"/>
+      <w:pPr>
+        <w:tabs>
+          <w:tab w:val="num" w:pos="2160"/>
+        </w:tabs>
+        <w:ind w:left="2160" w:hanging="360"/>
+      </w:pPr>
+      <w:rPr>
+        <w:rFonts w:ascii="OpenSymbol" w:hAnsi="OpenSymbol" w:cs="OpenSymbol" w:hint="default"/>
+        <w:sz w:val="24"/>
+        <w:szCs w:val="24"/>
+      </w:rPr>
+    </w:lvl>
+    <w:lvl w:ilvl="5">
+      <w:start w:val="1"/>
+      <w:numFmt w:val="bullet"/>
+      <w:lvlText w:val="▪"/>
+      <w:lvlJc w:val="left"/>
+      <w:pPr>
+        <w:tabs>
+          <w:tab w:val="num" w:pos="2520"/>
+        </w:tabs>
+        <w:ind w:left="2520" w:hanging="360"/>
+      </w:pPr>
+      <w:rPr>
+        <w:rFonts w:ascii="OpenSymbol" w:hAnsi="OpenSymbol" w:cs="OpenSymbol" w:hint="default"/>
+        <w:sz w:val="24"/>
+        <w:szCs w:val="24"/>
+      </w:rPr>
+    </w:lvl>
+    <w:lvl w:ilvl="6">
+      <w:start w:val="1"/>
+      <w:numFmt w:val="bullet"/>
+      <w:lvlText w:val=""/>
+      <w:lvlJc w:val="left"/>
+      <w:pPr>
+        <w:tabs>
+          <w:tab w:val="num" w:pos="2880"/>
+        </w:tabs>
+        <w:ind w:left="2880" w:hanging="360"/>
+      </w:pPr>
+      <w:rPr>
+        <w:rFonts w:ascii="Symbol" w:hAnsi="Symbol" w:cs="Symbol" w:hint="default"/>
+        <w:sz w:val="24"/>
+        <w:szCs w:val="24"/>
+      </w:rPr>
+    </w:lvl>
+    <w:lvl w:ilvl="7">
+      <w:start w:val="1"/>
+      <w:numFmt w:val="bullet"/>
+      <w:lvlText w:val="◦"/>
+      <w:lvlJc w:val="left"/>
+      <w:pPr>
+        <w:tabs>
+          <w:tab w:val="num" w:pos="3240"/>
+        </w:tabs>
+        <w:ind w:left="3240" w:hanging="360"/>
+      </w:pPr>
+      <w:rPr>
+        <w:rFonts w:ascii="OpenSymbol" w:hAnsi="OpenSymbol" w:cs="OpenSymbol" w:hint="default"/>
+        <w:sz w:val="24"/>
+        <w:szCs w:val="24"/>
+      </w:rPr>
+    </w:lvl>
+    <w:lvl w:ilvl="8">
+      <w:start w:val="1"/>
+      <w:numFmt w:val="bullet"/>
+      <w:lvlText w:val="▪"/>
+      <w:lvlJc w:val="left"/>
+      <w:pPr>
+        <w:tabs>
+          <w:tab w:val="num" w:pos="3600"/>
+        </w:tabs>
+        <w:ind w:left="3600" w:hanging="360"/>
+      </w:pPr>
+      <w:rPr>
+        <w:rFonts w:ascii="OpenSymbol" w:hAnsi="OpenSymbol" w:cs="OpenSymbol" w:hint="default"/>
+        <w:sz w:val="24"/>
+        <w:szCs w:val="24"/>
+      </w:rPr>
+    </w:lvl>
+  </w:abstractNum>
+  <w:abstractNum w:abstractNumId="71">
+    <w:lvl w:ilvl="0">
+      <w:start w:val="1"/>
+      <w:numFmt w:val="bullet"/>
+      <w:lvlText w:val=""/>
+      <w:lvlJc w:val="left"/>
+      <w:pPr>
+        <w:tabs>
+          <w:tab w:val="num" w:pos="720"/>
+        </w:tabs>
+        <w:ind w:left="720" w:hanging="360"/>
+      </w:pPr>
+      <w:rPr>
+        <w:rFonts w:ascii="Symbol" w:hAnsi="Symbol" w:cs="Symbol" w:hint="default"/>
+        <w:sz w:val="24"/>
+        <w:szCs w:val="24"/>
+      </w:rPr>
+    </w:lvl>
+    <w:lvl w:ilvl="1">
+      <w:start w:val="1"/>
+      <w:numFmt w:val="bullet"/>
+      <w:lvlText w:val="◦"/>
+      <w:lvlJc w:val="left"/>
+      <w:pPr>
+        <w:tabs>
+          <w:tab w:val="num" w:pos="1080"/>
+        </w:tabs>
+        <w:ind w:left="1080" w:hanging="360"/>
+      </w:pPr>
+      <w:rPr>
+        <w:rFonts w:ascii="OpenSymbol" w:hAnsi="OpenSymbol" w:cs="OpenSymbol" w:hint="default"/>
+        <w:sz w:val="24"/>
+        <w:szCs w:val="24"/>
+      </w:rPr>
+    </w:lvl>
+    <w:lvl w:ilvl="2">
+      <w:start w:val="1"/>
+      <w:numFmt w:val="bullet"/>
+      <w:lvlText w:val="▪"/>
+      <w:lvlJc w:val="left"/>
+      <w:pPr>
+        <w:tabs>
+          <w:tab w:val="num" w:pos="1440"/>
+        </w:tabs>
+        <w:ind w:left="1440" w:hanging="360"/>
+      </w:pPr>
+      <w:rPr>
+        <w:rFonts w:ascii="OpenSymbol" w:hAnsi="OpenSymbol" w:cs="OpenSymbol" w:hint="default"/>
+        <w:sz w:val="24"/>
+        <w:szCs w:val="24"/>
+      </w:rPr>
+    </w:lvl>
+    <w:lvl w:ilvl="3">
+      <w:start w:val="1"/>
+      <w:numFmt w:val="bullet"/>
+      <w:lvlText w:val=""/>
+      <w:lvlJc w:val="left"/>
+      <w:pPr>
+        <w:tabs>
+          <w:tab w:val="num" w:pos="1800"/>
+        </w:tabs>
+        <w:ind w:left="1800" w:hanging="360"/>
+      </w:pPr>
+      <w:rPr>
+        <w:rFonts w:ascii="Symbol" w:hAnsi="Symbol" w:cs="Symbol" w:hint="default"/>
+        <w:sz w:val="24"/>
+        <w:szCs w:val="24"/>
+      </w:rPr>
+    </w:lvl>
+    <w:lvl w:ilvl="4">
+      <w:start w:val="1"/>
+      <w:numFmt w:val="bullet"/>
+      <w:lvlText w:val="◦"/>
+      <w:lvlJc w:val="left"/>
+      <w:pPr>
+        <w:tabs>
+          <w:tab w:val="num" w:pos="2160"/>
+        </w:tabs>
+        <w:ind w:left="2160" w:hanging="360"/>
+      </w:pPr>
+      <w:rPr>
+        <w:rFonts w:ascii="OpenSymbol" w:hAnsi="OpenSymbol" w:cs="OpenSymbol" w:hint="default"/>
+        <w:sz w:val="24"/>
+        <w:szCs w:val="24"/>
+      </w:rPr>
+    </w:lvl>
+    <w:lvl w:ilvl="5">
+      <w:start w:val="1"/>
+      <w:numFmt w:val="bullet"/>
+      <w:lvlText w:val="▪"/>
+      <w:lvlJc w:val="left"/>
+      <w:pPr>
+        <w:tabs>
+          <w:tab w:val="num" w:pos="2520"/>
+        </w:tabs>
+        <w:ind w:left="2520" w:hanging="360"/>
+      </w:pPr>
+      <w:rPr>
+        <w:rFonts w:ascii="OpenSymbol" w:hAnsi="OpenSymbol" w:cs="OpenSymbol" w:hint="default"/>
+        <w:sz w:val="24"/>
+        <w:szCs w:val="24"/>
+      </w:rPr>
+    </w:lvl>
+    <w:lvl w:ilvl="6">
+      <w:start w:val="1"/>
+      <w:numFmt w:val="bullet"/>
+      <w:lvlText w:val=""/>
+      <w:lvlJc w:val="left"/>
+      <w:pPr>
+        <w:tabs>
+          <w:tab w:val="num" w:pos="2880"/>
+        </w:tabs>
+        <w:ind w:left="2880" w:hanging="360"/>
+      </w:pPr>
+      <w:rPr>
+        <w:rFonts w:ascii="Symbol" w:hAnsi="Symbol" w:cs="Symbol" w:hint="default"/>
+        <w:sz w:val="24"/>
+        <w:szCs w:val="24"/>
+      </w:rPr>
+    </w:lvl>
+    <w:lvl w:ilvl="7">
+      <w:start w:val="1"/>
+      <w:numFmt w:val="bullet"/>
+      <w:lvlText w:val="◦"/>
+      <w:lvlJc w:val="left"/>
+      <w:pPr>
+        <w:tabs>
+          <w:tab w:val="num" w:pos="3240"/>
+        </w:tabs>
+        <w:ind w:left="3240" w:hanging="360"/>
+      </w:pPr>
+      <w:rPr>
+        <w:rFonts w:ascii="OpenSymbol" w:hAnsi="OpenSymbol" w:cs="OpenSymbol" w:hint="default"/>
+        <w:sz w:val="24"/>
+        <w:szCs w:val="24"/>
+      </w:rPr>
+    </w:lvl>
+    <w:lvl w:ilvl="8">
+      <w:start w:val="1"/>
+      <w:numFmt w:val="bullet"/>
+      <w:lvlText w:val="▪"/>
+      <w:lvlJc w:val="left"/>
+      <w:pPr>
+        <w:tabs>
+          <w:tab w:val="num" w:pos="3600"/>
+        </w:tabs>
+        <w:ind w:left="3600" w:hanging="360"/>
+      </w:pPr>
+      <w:rPr>
+        <w:rFonts w:ascii="OpenSymbol" w:hAnsi="OpenSymbol" w:cs="OpenSymbol" w:hint="default"/>
+        <w:sz w:val="24"/>
+        <w:szCs w:val="24"/>
+      </w:rPr>
+    </w:lvl>
+  </w:abstractNum>
+  <w:abstractNum w:abstractNumId="72">
     <w:lvl w:ilvl="0">
       <w:start w:val="1"/>
       <w:numFmt w:val="none"/>
@@ -30579,6 +31822,18 @@
   <w:num w:numId="68">
     <w:abstractNumId w:val="68"/>
   </w:num>
+  <w:num w:numId="69">
+    <w:abstractNumId w:val="69"/>
+  </w:num>
+  <w:num w:numId="70">
+    <w:abstractNumId w:val="70"/>
+  </w:num>
+  <w:num w:numId="71">
+    <w:abstractNumId w:val="71"/>
+  </w:num>
+  <w:num w:numId="72">
+    <w:abstractNumId w:val="72"/>
+  </w:num>
 </w:numbering>
 </file>
 
@@ -30606,7 +31861,7 @@
     <w:pPr>
       <w:widowControl/>
       <w:suppressAutoHyphens w:val="true"/>
-      <w:overflowPunct w:val="false"/>
+      <w:overflowPunct w:val="true"/>
       <w:bidi w:val="0"/>
       <w:spacing w:lineRule="auto" w:line="259" w:before="0" w:after="160"/>
       <w:jc w:val="left"/>

</xml_diff>

<commit_message>
implement task of review
</commit_message>
<xml_diff>
--- a/WEEK 4.1.docx
+++ b/WEEK 4.1.docx
@@ -17521,8 +17521,10 @@
       </w:pPr>
       <w:r>
         <w:rPr>
-          <w:rFonts w:ascii="aptos" w:hAnsi="aptos"/>
+          <w:b w:val="false"/>
+          <w:bCs w:val="false"/>
           <w:i w:val="false"/>
+          <w:iCs w:val="false"/>
           <w:caps w:val="false"/>
           <w:smallCaps w:val="false"/>
           <w:strike w:val="false"/>
@@ -20438,15 +20440,7 @@
           <w:sz w:val="28"/>
           <w:szCs w:val="28"/>
         </w:rPr>
-        <w:t>W</w:t>
-      </w:r>
-      <w:r>
-        <w:rPr>
-          <w:rFonts w:ascii="aptos" w:hAnsi="aptos"/>
-          <w:sz w:val="28"/>
-          <w:szCs w:val="28"/>
-        </w:rPr>
-        <w:t>e can add multiple interceptor for different action.</w:t>
+        <w:t>We can add multiple interceptor for different action.</w:t>
       </w:r>
     </w:p>
     <w:p>
@@ -20492,15 +20486,7 @@
           <w:sz w:val="28"/>
           <w:szCs w:val="28"/>
         </w:rPr>
-        <w:t>R</w:t>
-      </w:r>
-      <w:r>
-        <w:rPr>
-          <w:rFonts w:ascii="aptos" w:hAnsi="aptos"/>
-          <w:sz w:val="28"/>
-          <w:szCs w:val="28"/>
-        </w:rPr>
-        <w:t>equest interceptor are executed in reverse order (LIFO).this is done so that default system configuration (by default config) can be overriden by more specific,</w:t>
+        <w:t>Request interceptor are executed in reverse order (LIFO).this is done so that default system configuration (by default config) can be overriden by more specific,</w:t>
       </w:r>
     </w:p>
     <w:p>
@@ -20523,15 +20509,7 @@
           <w:sz w:val="28"/>
           <w:szCs w:val="28"/>
         </w:rPr>
-        <w:t>R</w:t>
-      </w:r>
-      <w:r>
-        <w:rPr>
-          <w:rFonts w:ascii="aptos" w:hAnsi="aptos"/>
-          <w:sz w:val="28"/>
-          <w:szCs w:val="28"/>
-        </w:rPr>
-        <w:t xml:space="preserve">esponse interceptor are executed in same order they were added (FIFO) </w:t>
+        <w:t xml:space="preserve">Response interceptor are executed in same order they were added (FIFO) </w:t>
       </w:r>
     </w:p>
     <w:p>
@@ -20554,15 +20532,7 @@
           <w:sz w:val="28"/>
           <w:szCs w:val="28"/>
         </w:rPr>
-        <w:t>I</w:t>
-      </w:r>
-      <w:r>
-        <w:rPr>
-          <w:rFonts w:ascii="aptos" w:hAnsi="aptos"/>
-          <w:sz w:val="28"/>
-          <w:szCs w:val="28"/>
-        </w:rPr>
-        <w:t>nterceptor pass the result to the next interceptor.</w:t>
+        <w:t>Interceptor pass the result to the next interceptor.</w:t>
       </w:r>
     </w:p>
     <w:p>
@@ -21132,47 +21102,7 @@
           <w:sz w:val="28"/>
           <w:szCs w:val="28"/>
         </w:rPr>
-        <w:t xml:space="preserve">Ans: </w:t>
-      </w:r>
-      <w:r>
-        <w:rPr>
-          <w:rFonts w:ascii="aptos" w:hAnsi="aptos"/>
-          <w:sz w:val="28"/>
-          <w:szCs w:val="28"/>
-        </w:rPr>
-        <w:t>for customize the specific error message, we can compare it with the status code if(error.response.</w:t>
-      </w:r>
-      <w:r>
-        <w:rPr>
-          <w:rFonts w:ascii="aptos" w:hAnsi="aptos"/>
-          <w:sz w:val="28"/>
-          <w:szCs w:val="28"/>
-        </w:rPr>
-        <w:t>status === 400</w:t>
-      </w:r>
-      <w:r>
-        <w:rPr>
-          <w:rFonts w:ascii="aptos" w:hAnsi="aptos"/>
-          <w:sz w:val="28"/>
-          <w:szCs w:val="28"/>
-        </w:rPr>
-        <w:t>)</w:t>
-      </w:r>
-      <w:r>
-        <w:rPr>
-          <w:rFonts w:ascii="aptos" w:hAnsi="aptos"/>
-          <w:sz w:val="28"/>
-          <w:szCs w:val="28"/>
-        </w:rPr>
-        <w:t xml:space="preserve">  </w:t>
-      </w:r>
-      <w:r>
-        <w:rPr>
-          <w:rFonts w:ascii="aptos" w:hAnsi="aptos"/>
-          <w:sz w:val="28"/>
-          <w:szCs w:val="28"/>
-        </w:rPr>
-        <w:t>and simply return the cutomize error we want to print.</w:t>
+        <w:t>Ans: for customize the specific error message, we can compare it with the status code if(error.response.status === 400)  and simply return the cutomize error we want to print.</w:t>
       </w:r>
     </w:p>
     <w:p>
@@ -21319,15 +21249,7 @@
           <w:sz w:val="28"/>
           <w:szCs w:val="28"/>
         </w:rPr>
-        <w:t>Ans: If we add a extra space, then pace character in a URL query string is encoded as %</w:t>
-      </w:r>
-      <w:r>
-        <w:rPr>
-          <w:rFonts w:ascii="aptos" w:hAnsi="aptos"/>
-          <w:sz w:val="28"/>
-          <w:szCs w:val="28"/>
-        </w:rPr>
-        <w:t>20 or +.</w:t>
+        <w:t>Ans: If we add a extra space, then pace character in a URL query string is encoded as %20 or +.</w:t>
       </w:r>
     </w:p>
     <w:p>
@@ -21582,7 +21504,11 @@
         </w:rPr>
       </w:pPr>
       <w:r>
-        <w:rPr/>
+        <w:rPr>
+          <w:rFonts w:eastAsia="Aptos" w:cs="DejaVu Sans" w:ascii="aptos" w:hAnsi="aptos"/>
+          <w:sz w:val="28"/>
+          <w:szCs w:val="28"/>
+        </w:rPr>
       </w:r>
     </w:p>
     <w:p>
@@ -21597,7 +21523,11 @@
         </w:rPr>
       </w:pPr>
       <w:r>
-        <w:rPr/>
+        <w:rPr>
+          <w:rFonts w:eastAsia="Aptos" w:cs="DejaVu Sans" w:ascii="aptos" w:hAnsi="aptos"/>
+          <w:sz w:val="28"/>
+          <w:szCs w:val="28"/>
+        </w:rPr>
       </w:r>
     </w:p>
     <w:p>
@@ -21649,8 +21579,19 @@
           <w:sz w:val="28"/>
           <w:szCs w:val="28"/>
         </w:rPr>
-        <w:t xml:space="preserve">In catch block, </w:t>
-      </w:r>
+        <w:t>In catch block, we set the filter for the specific error (404-not found)</w:t>
+      </w:r>
+    </w:p>
+    <w:p>
+      <w:pPr>
+        <w:pStyle w:val="TextBody"/>
+        <w:numPr>
+          <w:ilvl w:val="0"/>
+          <w:numId w:val="69"/>
+        </w:numPr>
+        <w:jc w:val="left"/>
+        <w:rPr/>
+      </w:pPr>
       <w:r>
         <w:rPr>
           <w:rStyle w:val="SourceText"/>
@@ -21658,87 +21599,59 @@
           <w:sz w:val="28"/>
           <w:szCs w:val="28"/>
         </w:rPr>
-        <w:t>we set the filter for the specific error (404-not found)</w:t>
-      </w:r>
-    </w:p>
-    <w:p>
-      <w:pPr>
-        <w:pStyle w:val="TextBody"/>
-        <w:numPr>
-          <w:ilvl w:val="0"/>
-          <w:numId w:val="69"/>
-        </w:numPr>
-        <w:jc w:val="left"/>
+        <w:t>setTasks(currentTasks =&gt; currentTasks.filter(task =&gt; task.id !== clickedTaskId));</w:t>
+      </w:r>
+    </w:p>
+    <w:p>
+      <w:pPr>
+        <w:pStyle w:val="TextBody"/>
+        <w:jc w:val="both"/>
+        <w:rPr>
+          <w:rFonts w:ascii="aptos" w:hAnsi="aptos"/>
+          <w:sz w:val="28"/>
+          <w:szCs w:val="28"/>
+        </w:rPr>
+      </w:pPr>
+      <w:r>
+        <w:rPr>
+          <w:rFonts w:ascii="aptos" w:hAnsi="aptos"/>
+          <w:sz w:val="28"/>
+          <w:szCs w:val="28"/>
+        </w:rPr>
+      </w:r>
+    </w:p>
+    <w:p>
+      <w:pPr>
+        <w:pStyle w:val="TextBody"/>
+        <w:jc w:val="both"/>
+        <w:rPr>
+          <w:rFonts w:ascii="aptos" w:hAnsi="aptos"/>
+          <w:sz w:val="28"/>
+          <w:szCs w:val="28"/>
+        </w:rPr>
+      </w:pPr>
+      <w:r>
+        <w:rPr>
+          <w:rFonts w:ascii="aptos" w:hAnsi="aptos"/>
+          <w:sz w:val="28"/>
+          <w:szCs w:val="28"/>
+        </w:rPr>
+        <w:t>9. Page navigation survive.</w:t>
+      </w:r>
+    </w:p>
+    <w:p>
+      <w:pPr>
+        <w:pStyle w:val="TextBody"/>
+        <w:jc w:val="both"/>
         <w:rPr/>
       </w:pPr>
       <w:r>
         <w:rPr>
-          <w:rStyle w:val="SourceText"/>
-          <w:rFonts w:eastAsia="Aptos" w:cs="DejaVu Sans" w:ascii="aptos" w:hAnsi="aptos"/>
-          <w:sz w:val="28"/>
-          <w:szCs w:val="28"/>
-        </w:rPr>
-        <w:t>setTasks(currentTasks =&gt; currentTasks.filter(task =&gt; task.id !== clickedTaskId));</w:t>
-      </w:r>
-    </w:p>
-    <w:p>
-      <w:pPr>
-        <w:pStyle w:val="TextBody"/>
-        <w:jc w:val="both"/>
-        <w:rPr>
-          <w:rFonts w:ascii="aptos" w:hAnsi="aptos"/>
-          <w:sz w:val="28"/>
-          <w:szCs w:val="28"/>
-        </w:rPr>
-      </w:pPr>
-      <w:r>
-        <w:rPr>
-          <w:rFonts w:ascii="aptos" w:hAnsi="aptos"/>
-          <w:sz w:val="28"/>
-          <w:szCs w:val="28"/>
-        </w:rPr>
-      </w:r>
-    </w:p>
-    <w:p>
-      <w:pPr>
-        <w:pStyle w:val="TextBody"/>
-        <w:jc w:val="both"/>
-        <w:rPr>
-          <w:rFonts w:ascii="aptos" w:hAnsi="aptos"/>
-          <w:sz w:val="28"/>
-          <w:szCs w:val="28"/>
-        </w:rPr>
-      </w:pPr>
-      <w:r>
-        <w:rPr>
-          <w:rFonts w:ascii="aptos" w:hAnsi="aptos"/>
-          <w:sz w:val="28"/>
-          <w:szCs w:val="28"/>
-        </w:rPr>
-        <w:t>9. Page navigation survive.</w:t>
-      </w:r>
-    </w:p>
-    <w:p>
-      <w:pPr>
-        <w:pStyle w:val="TextBody"/>
-        <w:jc w:val="both"/>
-        <w:rPr/>
-      </w:pPr>
-      <w:r>
-        <w:rPr>
-          <w:rFonts w:ascii="aptos" w:hAnsi="aptos"/>
-          <w:sz w:val="28"/>
-          <w:szCs w:val="28"/>
-        </w:rPr>
-        <w:t xml:space="preserve">Ans: </w:t>
-      </w:r>
-      <w:r>
-        <w:rPr>
-          <w:rFonts w:ascii="aptos" w:hAnsi="aptos"/>
-          <w:sz w:val="28"/>
-          <w:szCs w:val="28"/>
-        </w:rPr>
-        <w:t>we can store the filtered data in local storage and then we can get the filtered data while page navigation.</w:t>
+          <w:rFonts w:ascii="aptos" w:hAnsi="aptos"/>
+          <w:sz w:val="28"/>
+          <w:szCs w:val="28"/>
+        </w:rPr>
+        <w:t>Ans:  we can store the filtered data in local storage and then we can get the filtered data while page navigation.</w:t>
       </w:r>
     </w:p>
     <w:p>
@@ -21749,7 +21662,10 @@
           <w:numId w:val="71"/>
         </w:numPr>
         <w:jc w:val="both"/>
-        <w:rPr/>
+        <w:rPr>
+          <w:sz w:val="28"/>
+          <w:szCs w:val="28"/>
+        </w:rPr>
       </w:pPr>
       <w:r>
         <w:rPr>
@@ -21768,23 +21684,18 @@
           <w:numId w:val="71"/>
         </w:numPr>
         <w:jc w:val="both"/>
-        <w:rPr/>
-      </w:pPr>
-      <w:r>
-        <w:rPr>
-          <w:rFonts w:ascii="aptos" w:hAnsi="aptos"/>
-          <w:sz w:val="28"/>
-          <w:szCs w:val="28"/>
-        </w:rPr>
-        <w:t xml:space="preserve">So we can use </w:t>
-      </w:r>
-      <w:r>
-        <w:rPr>
-          <w:rFonts w:ascii="aptos" w:hAnsi="aptos"/>
-          <w:sz w:val="28"/>
-          <w:szCs w:val="28"/>
-        </w:rPr>
-        <w:t>global component and set the filtered data in it so we can use it anywhere.</w:t>
+        <w:rPr>
+          <w:sz w:val="28"/>
+          <w:szCs w:val="28"/>
+        </w:rPr>
+      </w:pPr>
+      <w:r>
+        <w:rPr>
+          <w:rFonts w:ascii="aptos" w:hAnsi="aptos"/>
+          <w:sz w:val="28"/>
+          <w:szCs w:val="28"/>
+        </w:rPr>
+        <w:t>So we can use global component and set the filtered data in it so we can use it anywhere.</w:t>
       </w:r>
     </w:p>
     <w:p>
@@ -21794,25 +21705,150 @@
           <w:ilvl w:val="0"/>
           <w:numId w:val="71"/>
         </w:numPr>
+        <w:jc w:val="both"/>
+        <w:rPr>
+          <w:sz w:val="28"/>
+          <w:szCs w:val="28"/>
+        </w:rPr>
+      </w:pPr>
+      <w:r>
+        <w:rPr>
+          <w:rFonts w:ascii="aptos" w:hAnsi="aptos"/>
+          <w:sz w:val="28"/>
+          <w:szCs w:val="28"/>
+        </w:rPr>
+        <w:t>We can also tanstack query to store the data in queryKey and queryFn.</w:t>
+      </w:r>
+    </w:p>
+    <w:p>
+      <w:pPr>
+        <w:pStyle w:val="TextBody"/>
+        <w:numPr>
+          <w:ilvl w:val="0"/>
+          <w:numId w:val="71"/>
+        </w:numPr>
+        <w:jc w:val="both"/>
+        <w:rPr>
+          <w:sz w:val="28"/>
+          <w:szCs w:val="28"/>
+        </w:rPr>
+      </w:pPr>
+      <w:r>
+        <w:rPr>
+          <w:sz w:val="28"/>
+          <w:szCs w:val="28"/>
+        </w:rPr>
+        <w:t>Tanstack query stored the data in its cache. When we navigate the pages, the queryClient stays alive, so the cached data is still available.</w:t>
+      </w:r>
+    </w:p>
+    <w:p>
+      <w:pPr>
+        <w:pStyle w:val="TextBody"/>
+        <w:numPr>
+          <w:ilvl w:val="0"/>
+          <w:numId w:val="71"/>
+        </w:numPr>
+        <w:jc w:val="both"/>
+        <w:rPr>
+          <w:sz w:val="28"/>
+          <w:szCs w:val="28"/>
+        </w:rPr>
+      </w:pPr>
+      <w:r>
+        <w:rPr>
+          <w:sz w:val="28"/>
+          <w:szCs w:val="28"/>
+        </w:rPr>
+        <w:t>And also tanstack query send the cached data to all the components which request the queryKey.</w:t>
+      </w:r>
+    </w:p>
+    <w:p>
+      <w:pPr>
+        <w:pStyle w:val="TextBody"/>
+        <w:numPr>
+          <w:ilvl w:val="0"/>
+          <w:numId w:val="71"/>
+        </w:numPr>
+        <w:jc w:val="both"/>
+        <w:rPr>
+          <w:sz w:val="28"/>
+          <w:szCs w:val="28"/>
+        </w:rPr>
+      </w:pPr>
+      <w:r>
+        <w:rPr>
+          <w:rFonts w:ascii="aptos" w:hAnsi="aptos"/>
+          <w:sz w:val="28"/>
+          <w:szCs w:val="28"/>
+        </w:rPr>
+        <w:t>Tanstack query is used for the manage the data that comes from the server.</w:t>
+      </w:r>
+    </w:p>
+    <w:p>
+      <w:pPr>
+        <w:pStyle w:val="TextBody"/>
+        <w:numPr>
+          <w:ilvl w:val="0"/>
+          <w:numId w:val="71"/>
+        </w:numPr>
+        <w:jc w:val="both"/>
+        <w:rPr>
+          <w:sz w:val="28"/>
+          <w:szCs w:val="28"/>
+        </w:rPr>
+      </w:pPr>
+      <w:r>
+        <w:rPr>
+          <w:rFonts w:ascii="aptos" w:hAnsi="aptos"/>
+          <w:sz w:val="28"/>
+          <w:szCs w:val="28"/>
+        </w:rPr>
+        <w:t>There are two main thing in tanstack.</w:t>
+      </w:r>
+    </w:p>
+    <w:p>
+      <w:pPr>
+        <w:pStyle w:val="TextBody"/>
+        <w:numPr>
+          <w:ilvl w:val="0"/>
+          <w:numId w:val="71"/>
+        </w:numPr>
+        <w:jc w:val="both"/>
+        <w:rPr>
+          <w:sz w:val="28"/>
+          <w:szCs w:val="28"/>
+        </w:rPr>
+      </w:pPr>
+      <w:r>
+        <w:rPr>
+          <w:rFonts w:ascii="aptos" w:hAnsi="aptos"/>
+          <w:sz w:val="28"/>
+          <w:szCs w:val="28"/>
+        </w:rPr>
+        <w:t>QueryFn: it is the function that actually fetch the data (how to get the data).</w:t>
+      </w:r>
+    </w:p>
+    <w:p>
+      <w:pPr>
+        <w:pStyle w:val="TextBody"/>
+        <w:numPr>
+          <w:ilvl w:val="0"/>
+          <w:numId w:val="71"/>
+        </w:numPr>
         <w:spacing w:before="0" w:after="140"/>
         <w:jc w:val="both"/>
-        <w:rPr/>
-      </w:pPr>
-      <w:r>
-        <w:rPr>
-          <w:rFonts w:ascii="aptos" w:hAnsi="aptos"/>
-          <w:sz w:val="28"/>
-          <w:szCs w:val="28"/>
-        </w:rPr>
-        <w:t>W</w:t>
-      </w:r>
-      <w:r>
-        <w:rPr>
-          <w:rFonts w:ascii="aptos" w:hAnsi="aptos"/>
-          <w:sz w:val="28"/>
-          <w:szCs w:val="28"/>
-        </w:rPr>
-        <w:t>e can also use zustand and tanstack query to store the data in queryKey and queryFn.</w:t>
+        <w:rPr>
+          <w:sz w:val="28"/>
+          <w:szCs w:val="28"/>
+        </w:rPr>
+      </w:pPr>
+      <w:r>
+        <w:rPr>
+          <w:rFonts w:ascii="aptos" w:hAnsi="aptos"/>
+          <w:sz w:val="28"/>
+          <w:szCs w:val="28"/>
+        </w:rPr>
+        <w:t>QueryKey: This is unique name for the data.(What data is this?)</w:t>
       </w:r>
     </w:p>
     <w:sectPr>
@@ -31861,7 +31897,7 @@
     <w:pPr>
       <w:widowControl/>
       <w:suppressAutoHyphens w:val="true"/>
-      <w:overflowPunct w:val="true"/>
+      <w:overflowPunct w:val="false"/>
       <w:bidi w:val="0"/>
       <w:spacing w:lineRule="auto" w:line="259" w:before="0" w:after="160"/>
       <w:jc w:val="left"/>
@@ -32469,6 +32505,46 @@
       <w:bCs/>
     </w:rPr>
   </w:style>
+  <w:style w:type="paragraph" w:styleId="PreformattedText">
+    <w:name w:val="Preformatted Text"/>
+    <w:basedOn w:val="Normal"/>
+    <w:qFormat/>
+    <w:pPr>
+      <w:spacing w:before="0" w:after="0"/>
+    </w:pPr>
+    <w:rPr>
+      <w:rFonts w:ascii="Liberation Mono" w:hAnsi="Liberation Mono" w:eastAsia="Liberation Mono" w:cs="Liberation Mono"/>
+      <w:sz w:val="20"/>
+      <w:szCs w:val="20"/>
+    </w:rPr>
+  </w:style>
+  <w:style w:type="paragraph" w:styleId="Quotations">
+    <w:name w:val="Quotations"/>
+    <w:basedOn w:val="Normal"/>
+    <w:qFormat/>
+    <w:pPr>
+      <w:spacing w:before="0" w:after="283"/>
+      <w:ind w:left="567" w:right="567" w:hanging="0"/>
+    </w:pPr>
+    <w:rPr/>
+  </w:style>
+  <w:style w:type="paragraph" w:styleId="HorizontalLine">
+    <w:name w:val="Horizontal Line"/>
+    <w:basedOn w:val="Normal"/>
+    <w:next w:val="TextBody"/>
+    <w:qFormat/>
+    <w:pPr>
+      <w:suppressLineNumbers/>
+      <w:pBdr>
+        <w:bottom w:val="double" w:sz="2" w:space="0" w:color="808080"/>
+      </w:pBdr>
+      <w:spacing w:before="0" w:after="283"/>
+    </w:pPr>
+    <w:rPr>
+      <w:sz w:val="12"/>
+      <w:szCs w:val="12"/>
+    </w:rPr>
+  </w:style>
   <w:style w:type="numbering" w:styleId="NoList">
     <w:name w:val="No List"/>
     <w:qFormat/>

</xml_diff>